<commit_message>
add new change: ABC
</commit_message>
<xml_diff>
--- a/quest_solution.docx
+++ b/quest_solution.docx
@@ -1,13 +1,40 @@
 
 <file path=word/document.xml><?xml version="1.0" encoding="utf-8"?>
-<w:document xmlns:wpc="http://schemas.microsoft.com/office/word/2010/wordprocessingCanvas" xmlns:cx="http://schemas.microsoft.com/office/drawing/2014/chartex" xmlns:cx1="http://schemas.microsoft.com/office/drawing/2015/9/8/chartex" xmlns:cx2="http://schemas.microsoft.com/office/drawing/2015/10/21/chartex" xmlns:cx3="http://schemas.microsoft.com/office/drawing/2016/5/9/chartex" xmlns:cx4="http://schemas.microsoft.com/office/drawing/2016/5/10/chartex" xmlns:cx5="http://schemas.microsoft.com/office/drawing/2016/5/11/chartex" xmlns:cx6="http://schemas.microsoft.com/office/drawing/2016/5/12/chartex" xmlns:cx7="http://schemas.microsoft.com/office/drawing/2016/5/13/chartex" xmlns:cx8="http://schemas.microsoft.com/office/drawing/2016/5/14/chartex" xmlns:mc="http://schemas.openxmlformats.org/markup-compatibility/2006" xmlns:aink="http://schemas.microsoft.com/office/drawing/2016/ink" xmlns:am3d="http://schemas.microsoft.com/office/drawing/2017/model3d" xmlns:o="urn:schemas-microsoft-com:office:office" xmlns:oel="http://schemas.microsoft.com/office/2019/extlst" xmlns:r="http://schemas.openxmlformats.org/officeDocument/2006/relationships" xmlns:m="http://schemas.openxmlformats.org/officeDocument/2006/math" xmlns:v="urn:schemas-microsoft-com:vml" xmlns:wp14="http://schemas.microsoft.com/office/word/2010/wordprocessingDrawing" xmlns:wp="http://schemas.openxmlformats.org/drawingml/2006/wordprocessingDrawing" xmlns:w10="urn:schemas-microsoft-com:office:word" xmlns:w="http://schemas.openxmlformats.org/wordprocessingml/2006/main" xmlns:w14="http://schemas.microsoft.com/office/word/2010/wordml" xmlns:w15="http://schemas.microsoft.com/office/word/2012/wordml" xmlns:w16cex="http://schemas.microsoft.com/office/word/2018/wordml/cex" xmlns:w16cid="http://schemas.microsoft.com/office/word/2016/wordml/cid" xmlns:w16="http://schemas.microsoft.com/office/word/2018/wordml" xmlns:w16du="http://schemas.microsoft.com/office/word/2023/wordml/word16du" xmlns:w16sdtdh="http://schemas.microsoft.com/office/word/2020/wordml/sdtdatahash" xmlns:w16sdtfl="http://schemas.microsoft.com/office/word/2024/wordml/sdtformatlock" xmlns:w16se="http://schemas.microsoft.com/office/word/2015/wordml/symex" xmlns:wpg="http://schemas.microsoft.com/office/word/2010/wordprocessingGroup" xmlns:wpi="http://schemas.microsoft.com/office/word/2010/wordprocessingInk" xmlns:wne="http://schemas.microsoft.com/office/word/2006/wordml" xmlns:wps="http://schemas.microsoft.com/office/word/2010/wordprocessingShape" mc:Ignorable="w14 w15 w16se w16cid w16 w16cex w16sdtdh w16sdtfl w16du wp14">
+<w:document xmlns:wpc="http://schemas.microsoft.com/office/word/2010/wordprocessingCanvas" xmlns:cx="http://schemas.microsoft.com/office/drawing/2014/chartex" xmlns:cx1="http://schemas.microsoft.com/office/drawing/2015/9/8/chartex" xmlns:cx2="http://schemas.microsoft.com/office/drawing/2015/10/21/chartex" xmlns:cx3="http://schemas.microsoft.com/office/drawing/2016/5/9/chartex" xmlns:cx4="http://schemas.microsoft.com/office/drawing/2016/5/10/chartex" xmlns:cx5="http://schemas.microsoft.com/office/drawing/2016/5/11/chartex" xmlns:cx6="http://schemas.microsoft.com/office/drawing/2016/5/12/chartex" xmlns:cx7="http://schemas.microsoft.com/office/drawing/2016/5/13/chartex" xmlns:cx8="http://schemas.microsoft.com/office/drawing/2016/5/14/chartex" xmlns:mc="http://schemas.openxmlformats.org/markup-compatibility/2006" xmlns:aink="http://schemas.microsoft.com/office/drawing/2016/ink" xmlns:am3d="http://schemas.microsoft.com/office/drawing/2017/model3d" xmlns:o="urn:schemas-microsoft-com:office:office" xmlns:oel="http://schemas.microsoft.com/office/2019/extlst" xmlns:r="http://schemas.openxmlformats.org/officeDocument/2006/relationships" xmlns:m="http://schemas.openxmlformats.org/officeDocument/2006/math" xmlns:v="urn:schemas-microsoft-com:vml" xmlns:wp14="http://schemas.microsoft.com/office/word/2010/wordprocessingDrawing" xmlns:wp="http://schemas.openxmlformats.org/drawingml/2006/wordprocessingDrawing" xmlns:w10="urn:schemas-microsoft-com:office:word" xmlns:w="http://schemas.openxmlformats.org/wordprocessingml/2006/main" xmlns:w14="http://schemas.microsoft.com/office/word/2010/wordml" xmlns:w15="http://schemas.microsoft.com/office/word/2012/wordml" xmlns:w16cex="http://schemas.microsoft.com/office/word/2018/wordml/cex" xmlns:w16cid="http://schemas.microsoft.com/office/word/2016/wordml/cid" xmlns:w16="http://schemas.microsoft.com/office/word/2018/wordml" xmlns:w16sdtdh="http://schemas.microsoft.com/office/word/2020/wordml/sdtdatahash" xmlns:w16se="http://schemas.microsoft.com/office/word/2015/wordml/symex" xmlns:wpg="http://schemas.microsoft.com/office/word/2010/wordprocessingGroup" xmlns:wpi="http://schemas.microsoft.com/office/word/2010/wordprocessingInk" xmlns:wne="http://schemas.microsoft.com/office/word/2006/wordml" xmlns:wps="http://schemas.microsoft.com/office/word/2010/wordprocessingShape" mc:Ignorable="w14 w15 w16se w16cid w16 w16cex w16sdtdh wp14">
   <w:body>
+    <w:p>
+      <w:pPr>
+        <w:pStyle w:val="uMucluc"/>
+        <w:rPr>
+          <w:rFonts w:ascii="Times New Roman" w:eastAsiaTheme="minorHAnsi" w:hAnsi="Times New Roman" w:cs="Times New Roman"/>
+          <w:color w:val="auto"/>
+          <w:kern w:val="2"/>
+          <w:sz w:val="16"/>
+          <w:szCs w:val="16"/>
+          <w14:ligatures w14:val="standardContextual"/>
+        </w:rPr>
+      </w:pPr>
+      <w:r>
+        <w:rPr>
+          <w:rFonts w:ascii="Times New Roman" w:eastAsiaTheme="minorHAnsi" w:hAnsi="Times New Roman" w:cs="Times New Roman"/>
+          <w:color w:val="auto"/>
+          <w:kern w:val="2"/>
+          <w:sz w:val="16"/>
+          <w:szCs w:val="16"/>
+          <w14:ligatures w14:val="standardContextual"/>
+        </w:rPr>
+        <w:t>ABC</w:t>
+      </w:r>
+    </w:p>
     <w:sdt>
       <w:sdtPr>
         <w:rPr>
-          <w:rFonts w:ascii="Times New Roman" w:hAnsi="Times New Roman" w:cs="Times New Roman"/>
-          <w:sz w:val="16"/>
-          <w:szCs w:val="16"/>
+          <w:rFonts w:ascii="Times New Roman" w:eastAsiaTheme="minorHAnsi" w:hAnsi="Times New Roman" w:cs="Times New Roman"/>
+          <w:color w:val="auto"/>
+          <w:kern w:val="2"/>
+          <w:sz w:val="16"/>
+          <w:szCs w:val="16"/>
+          <w14:ligatures w14:val="standardContextual"/>
         </w:rPr>
         <w:id w:val="-1125079363"/>
         <w:docPartObj>
@@ -17,19 +44,15 @@
       </w:sdtPr>
       <w:sdtEndPr>
         <w:rPr>
-          <w:rFonts w:eastAsiaTheme="minorHAnsi"/>
           <w:b/>
           <w:bCs/>
           <w:noProof/>
-          <w:color w:val="auto"/>
-          <w:kern w:val="2"/>
-          <w14:ligatures w14:val="standardContextual"/>
         </w:rPr>
       </w:sdtEndPr>
       <w:sdtContent>
         <w:p>
           <w:pPr>
-            <w:pStyle w:val="TOCHeading"/>
+            <w:pStyle w:val="uMucluc"/>
             <w:rPr>
               <w:rFonts w:ascii="Times New Roman" w:hAnsi="Times New Roman" w:cs="Times New Roman"/>
               <w:sz w:val="16"/>
@@ -47,7 +70,7 @@
         </w:p>
         <w:p>
           <w:pPr>
-            <w:pStyle w:val="TOC1"/>
+            <w:pStyle w:val="Mucluc1"/>
             <w:tabs>
               <w:tab w:val="right" w:leader="dot" w:pos="9350"/>
             </w:tabs>
@@ -85,7 +108,7 @@
           <w:hyperlink w:anchor="_Toc199803733" w:history="1">
             <w:r>
               <w:rPr>
-                <w:rStyle w:val="Hyperlink"/>
+                <w:rStyle w:val="Siuktni"/>
                 <w:rFonts w:ascii="Times New Roman" w:hAnsi="Times New Roman" w:cs="Times New Roman"/>
                 <w:noProof/>
                 <w:sz w:val="16"/>
@@ -166,7 +189,7 @@
         </w:p>
         <w:p>
           <w:pPr>
-            <w:pStyle w:val="TOC1"/>
+            <w:pStyle w:val="Mucluc1"/>
             <w:tabs>
               <w:tab w:val="right" w:leader="dot" w:pos="9350"/>
             </w:tabs>
@@ -180,33 +203,13 @@
           <w:hyperlink w:anchor="_Toc199803734" w:history="1">
             <w:r>
               <w:rPr>
-                <w:rStyle w:val="Hyperlink"/>
+                <w:rStyle w:val="Siuktni"/>
                 <w:rFonts w:ascii="Times New Roman" w:hAnsi="Times New Roman" w:cs="Times New Roman"/>
                 <w:noProof/>
                 <w:sz w:val="16"/>
                 <w:szCs w:val="16"/>
               </w:rPr>
-              <w:t>1. What are 5 mega IT trends? (chapter - trang 2</w:t>
-            </w:r>
-            <w:r>
-              <w:rPr>
-                <w:rStyle w:val="Hyperlink"/>
-                <w:rFonts w:ascii="Times New Roman" w:hAnsi="Times New Roman" w:cs="Times New Roman"/>
-                <w:noProof/>
-                <w:sz w:val="16"/>
-                <w:szCs w:val="16"/>
-              </w:rPr>
-              <w:t>1</w:t>
-            </w:r>
-            <w:r>
-              <w:rPr>
-                <w:rStyle w:val="Hyperlink"/>
-                <w:rFonts w:ascii="Times New Roman" w:hAnsi="Times New Roman" w:cs="Times New Roman"/>
-                <w:noProof/>
-                <w:sz w:val="16"/>
-                <w:szCs w:val="16"/>
-              </w:rPr>
-              <w:t>4)</w:t>
+              <w:t>1. What are 5 mega IT trends? (chapter - trang 214)</w:t>
             </w:r>
             <w:r>
               <w:rPr>
@@ -281,7 +284,7 @@
         </w:p>
         <w:p>
           <w:pPr>
-            <w:pStyle w:val="TOC1"/>
+            <w:pStyle w:val="Mucluc1"/>
             <w:tabs>
               <w:tab w:val="right" w:leader="dot" w:pos="9350"/>
             </w:tabs>
@@ -295,7 +298,7 @@
           <w:hyperlink w:anchor="_Toc199803735" w:history="1">
             <w:r>
               <w:rPr>
-                <w:rStyle w:val="Hyperlink"/>
+                <w:rStyle w:val="Siuktni"/>
                 <w:rFonts w:ascii="Times New Roman" w:hAnsi="Times New Roman" w:cs="Times New Roman"/>
                 <w:noProof/>
                 <w:sz w:val="16"/>
@@ -376,7 +379,7 @@
         </w:p>
         <w:p>
           <w:pPr>
-            <w:pStyle w:val="TOC1"/>
+            <w:pStyle w:val="Mucluc1"/>
             <w:tabs>
               <w:tab w:val="right" w:leader="dot" w:pos="9350"/>
             </w:tabs>
@@ -390,7 +393,7 @@
           <w:hyperlink w:anchor="_Toc199803736" w:history="1">
             <w:r>
               <w:rPr>
-                <w:rStyle w:val="Hyperlink"/>
+                <w:rStyle w:val="Siuktni"/>
                 <w:rFonts w:ascii="Times New Roman" w:hAnsi="Times New Roman" w:cs="Times New Roman"/>
                 <w:noProof/>
                 <w:sz w:val="16"/>
@@ -471,7 +474,7 @@
         </w:p>
         <w:p>
           <w:pPr>
-            <w:pStyle w:val="TOC1"/>
+            <w:pStyle w:val="Mucluc1"/>
             <w:tabs>
               <w:tab w:val="right" w:leader="dot" w:pos="9350"/>
             </w:tabs>
@@ -485,7 +488,7 @@
           <w:hyperlink w:anchor="_Toc199803737" w:history="1">
             <w:r>
               <w:rPr>
-                <w:rStyle w:val="Hyperlink"/>
+                <w:rStyle w:val="Siuktni"/>
                 <w:rFonts w:ascii="Times New Roman" w:hAnsi="Times New Roman" w:cs="Times New Roman"/>
                 <w:noProof/>
                 <w:sz w:val="16"/>
@@ -566,7 +569,7 @@
         </w:p>
         <w:p>
           <w:pPr>
-            <w:pStyle w:val="TOC1"/>
+            <w:pStyle w:val="Mucluc1"/>
             <w:tabs>
               <w:tab w:val="right" w:leader="dot" w:pos="9350"/>
             </w:tabs>
@@ -580,7 +583,7 @@
           <w:hyperlink w:anchor="_Toc199803738" w:history="1">
             <w:r>
               <w:rPr>
-                <w:rStyle w:val="Hyperlink"/>
+                <w:rStyle w:val="Siuktni"/>
                 <w:rFonts w:ascii="Times New Roman" w:hAnsi="Times New Roman" w:cs="Times New Roman"/>
                 <w:noProof/>
                 <w:sz w:val="16"/>
@@ -661,7 +664,7 @@
         </w:p>
         <w:p>
           <w:pPr>
-            <w:pStyle w:val="TOC1"/>
+            <w:pStyle w:val="Mucluc1"/>
             <w:tabs>
               <w:tab w:val="right" w:leader="dot" w:pos="9350"/>
             </w:tabs>
@@ -675,7 +678,7 @@
           <w:hyperlink w:anchor="_Toc199803739" w:history="1">
             <w:r>
               <w:rPr>
-                <w:rStyle w:val="Hyperlink"/>
+                <w:rStyle w:val="Siuktni"/>
                 <w:rFonts w:ascii="Times New Roman" w:hAnsi="Times New Roman" w:cs="Times New Roman"/>
                 <w:noProof/>
                 <w:sz w:val="16"/>
@@ -756,7 +759,7 @@
         </w:p>
         <w:p>
           <w:pPr>
-            <w:pStyle w:val="TOC1"/>
+            <w:pStyle w:val="Mucluc1"/>
             <w:tabs>
               <w:tab w:val="right" w:leader="dot" w:pos="9350"/>
             </w:tabs>
@@ -770,7 +773,7 @@
           <w:hyperlink w:anchor="_Toc199803740" w:history="1">
             <w:r>
               <w:rPr>
-                <w:rStyle w:val="Hyperlink"/>
+                <w:rStyle w:val="Siuktni"/>
                 <w:rFonts w:ascii="Times New Roman" w:hAnsi="Times New Roman" w:cs="Times New Roman"/>
                 <w:noProof/>
                 <w:sz w:val="16"/>
@@ -851,7 +854,7 @@
         </w:p>
         <w:p>
           <w:pPr>
-            <w:pStyle w:val="TOC1"/>
+            <w:pStyle w:val="Mucluc1"/>
             <w:tabs>
               <w:tab w:val="right" w:leader="dot" w:pos="9350"/>
             </w:tabs>
@@ -865,7 +868,7 @@
           <w:hyperlink w:anchor="_Toc199803741" w:history="1">
             <w:r>
               <w:rPr>
-                <w:rStyle w:val="Hyperlink"/>
+                <w:rStyle w:val="Siuktni"/>
                 <w:rFonts w:ascii="Times New Roman" w:hAnsi="Times New Roman" w:cs="Times New Roman"/>
                 <w:noProof/>
                 <w:sz w:val="16"/>
@@ -946,7 +949,7 @@
         </w:p>
         <w:p>
           <w:pPr>
-            <w:pStyle w:val="TOC1"/>
+            <w:pStyle w:val="Mucluc1"/>
             <w:tabs>
               <w:tab w:val="right" w:leader="dot" w:pos="9350"/>
             </w:tabs>
@@ -960,7 +963,7 @@
           <w:hyperlink w:anchor="_Toc199803742" w:history="1">
             <w:r>
               <w:rPr>
-                <w:rStyle w:val="Hyperlink"/>
+                <w:rStyle w:val="Siuktni"/>
                 <w:rFonts w:ascii="Times New Roman" w:hAnsi="Times New Roman" w:cs="Times New Roman"/>
                 <w:noProof/>
                 <w:sz w:val="16"/>
@@ -1041,7 +1044,7 @@
         </w:p>
         <w:p>
           <w:pPr>
-            <w:pStyle w:val="TOC1"/>
+            <w:pStyle w:val="Mucluc1"/>
             <w:tabs>
               <w:tab w:val="right" w:leader="dot" w:pos="9350"/>
             </w:tabs>
@@ -1055,7 +1058,7 @@
           <w:hyperlink w:anchor="_Toc199803743" w:history="1">
             <w:r>
               <w:rPr>
-                <w:rStyle w:val="Hyperlink"/>
+                <w:rStyle w:val="Siuktni"/>
                 <w:rFonts w:ascii="Times New Roman" w:hAnsi="Times New Roman" w:cs="Times New Roman"/>
                 <w:noProof/>
                 <w:sz w:val="16"/>
@@ -1136,7 +1139,7 @@
         </w:p>
         <w:p>
           <w:pPr>
-            <w:pStyle w:val="TOC1"/>
+            <w:pStyle w:val="Mucluc1"/>
             <w:tabs>
               <w:tab w:val="right" w:leader="dot" w:pos="9350"/>
             </w:tabs>
@@ -1150,7 +1153,7 @@
           <w:hyperlink w:anchor="_Toc199803744" w:history="1">
             <w:r>
               <w:rPr>
-                <w:rStyle w:val="Hyperlink"/>
+                <w:rStyle w:val="Siuktni"/>
                 <w:rFonts w:ascii="Times New Roman" w:hAnsi="Times New Roman" w:cs="Times New Roman"/>
                 <w:noProof/>
                 <w:sz w:val="16"/>
@@ -1231,7 +1234,7 @@
         </w:p>
         <w:p>
           <w:pPr>
-            <w:pStyle w:val="TOC1"/>
+            <w:pStyle w:val="Mucluc1"/>
             <w:tabs>
               <w:tab w:val="right" w:leader="dot" w:pos="9350"/>
             </w:tabs>
@@ -1245,7 +1248,7 @@
           <w:hyperlink w:anchor="_Toc199803745" w:history="1">
             <w:r>
               <w:rPr>
-                <w:rStyle w:val="Hyperlink"/>
+                <w:rStyle w:val="Siuktni"/>
                 <w:rFonts w:ascii="Times New Roman" w:hAnsi="Times New Roman" w:cs="Times New Roman"/>
                 <w:noProof/>
                 <w:sz w:val="16"/>
@@ -1326,7 +1329,7 @@
         </w:p>
         <w:p>
           <w:pPr>
-            <w:pStyle w:val="TOC1"/>
+            <w:pStyle w:val="Mucluc1"/>
             <w:tabs>
               <w:tab w:val="right" w:leader="dot" w:pos="9350"/>
             </w:tabs>
@@ -1340,7 +1343,7 @@
           <w:hyperlink w:anchor="_Toc199803746" w:history="1">
             <w:r>
               <w:rPr>
-                <w:rStyle w:val="Hyperlink"/>
+                <w:rStyle w:val="Siuktni"/>
                 <w:rFonts w:ascii="Times New Roman" w:hAnsi="Times New Roman" w:cs="Times New Roman"/>
                 <w:noProof/>
                 <w:sz w:val="16"/>
@@ -1421,7 +1424,7 @@
         </w:p>
         <w:p>
           <w:pPr>
-            <w:pStyle w:val="TOC1"/>
+            <w:pStyle w:val="Mucluc1"/>
             <w:tabs>
               <w:tab w:val="right" w:leader="dot" w:pos="9350"/>
             </w:tabs>
@@ -1435,7 +1438,7 @@
           <w:hyperlink w:anchor="_Toc199803747" w:history="1">
             <w:r>
               <w:rPr>
-                <w:rStyle w:val="Hyperlink"/>
+                <w:rStyle w:val="Siuktni"/>
                 <w:rFonts w:ascii="Times New Roman" w:hAnsi="Times New Roman" w:cs="Times New Roman"/>
                 <w:noProof/>
                 <w:sz w:val="16"/>
@@ -1516,7 +1519,7 @@
         </w:p>
         <w:p>
           <w:pPr>
-            <w:pStyle w:val="TOC1"/>
+            <w:pStyle w:val="Mucluc1"/>
             <w:tabs>
               <w:tab w:val="right" w:leader="dot" w:pos="9350"/>
             </w:tabs>
@@ -1530,7 +1533,7 @@
           <w:hyperlink w:anchor="_Toc199803748" w:history="1">
             <w:r>
               <w:rPr>
-                <w:rStyle w:val="Hyperlink"/>
+                <w:rStyle w:val="Siuktni"/>
                 <w:rFonts w:ascii="Times New Roman" w:hAnsi="Times New Roman" w:cs="Times New Roman"/>
                 <w:noProof/>
                 <w:sz w:val="16"/>
@@ -1611,7 +1614,7 @@
         </w:p>
         <w:p>
           <w:pPr>
-            <w:pStyle w:val="TOC1"/>
+            <w:pStyle w:val="Mucluc1"/>
             <w:tabs>
               <w:tab w:val="right" w:leader="dot" w:pos="9350"/>
             </w:tabs>
@@ -1625,7 +1628,7 @@
           <w:hyperlink w:anchor="_Toc199803749" w:history="1">
             <w:r>
               <w:rPr>
-                <w:rStyle w:val="Hyperlink"/>
+                <w:rStyle w:val="Siuktni"/>
                 <w:rFonts w:ascii="Times New Roman" w:hAnsi="Times New Roman" w:cs="Times New Roman"/>
                 <w:noProof/>
                 <w:sz w:val="16"/>
@@ -1706,7 +1709,7 @@
         </w:p>
         <w:p>
           <w:pPr>
-            <w:pStyle w:val="TOC1"/>
+            <w:pStyle w:val="Mucluc1"/>
             <w:tabs>
               <w:tab w:val="right" w:leader="dot" w:pos="9350"/>
             </w:tabs>
@@ -1720,7 +1723,7 @@
           <w:hyperlink w:anchor="_Toc199803750" w:history="1">
             <w:r>
               <w:rPr>
-                <w:rStyle w:val="Hyperlink"/>
+                <w:rStyle w:val="Siuktni"/>
                 <w:rFonts w:ascii="Times New Roman" w:hAnsi="Times New Roman" w:cs="Times New Roman"/>
                 <w:noProof/>
                 <w:sz w:val="16"/>
@@ -1801,7 +1804,7 @@
         </w:p>
         <w:p>
           <w:pPr>
-            <w:pStyle w:val="TOC1"/>
+            <w:pStyle w:val="Mucluc1"/>
             <w:tabs>
               <w:tab w:val="right" w:leader="dot" w:pos="9350"/>
             </w:tabs>
@@ -1815,7 +1818,7 @@
           <w:hyperlink w:anchor="_Toc199803751" w:history="1">
             <w:r>
               <w:rPr>
-                <w:rStyle w:val="Hyperlink"/>
+                <w:rStyle w:val="Siuktni"/>
                 <w:rFonts w:ascii="Times New Roman" w:hAnsi="Times New Roman" w:cs="Times New Roman"/>
                 <w:noProof/>
                 <w:sz w:val="16"/>
@@ -1896,7 +1899,7 @@
         </w:p>
         <w:p>
           <w:pPr>
-            <w:pStyle w:val="TOC1"/>
+            <w:pStyle w:val="Mucluc1"/>
             <w:tabs>
               <w:tab w:val="right" w:leader="dot" w:pos="9350"/>
             </w:tabs>
@@ -1910,7 +1913,7 @@
           <w:hyperlink w:anchor="_Toc199803752" w:history="1">
             <w:r>
               <w:rPr>
-                <w:rStyle w:val="Hyperlink"/>
+                <w:rStyle w:val="Siuktni"/>
                 <w:rFonts w:ascii="Times New Roman" w:hAnsi="Times New Roman" w:cs="Times New Roman"/>
                 <w:noProof/>
                 <w:sz w:val="16"/>
@@ -1991,7 +1994,7 @@
         </w:p>
         <w:p>
           <w:pPr>
-            <w:pStyle w:val="TOC1"/>
+            <w:pStyle w:val="Mucluc1"/>
             <w:tabs>
               <w:tab w:val="right" w:leader="dot" w:pos="9350"/>
             </w:tabs>
@@ -2005,7 +2008,7 @@
           <w:hyperlink w:anchor="_Toc199803753" w:history="1">
             <w:r>
               <w:rPr>
-                <w:rStyle w:val="Hyperlink"/>
+                <w:rStyle w:val="Siuktni"/>
                 <w:rFonts w:ascii="Times New Roman" w:hAnsi="Times New Roman" w:cs="Times New Roman"/>
                 <w:noProof/>
                 <w:sz w:val="16"/>
@@ -2086,7 +2089,7 @@
         </w:p>
         <w:p>
           <w:pPr>
-            <w:pStyle w:val="TOC1"/>
+            <w:pStyle w:val="Mucluc1"/>
             <w:tabs>
               <w:tab w:val="right" w:leader="dot" w:pos="9350"/>
             </w:tabs>
@@ -2100,7 +2103,7 @@
           <w:hyperlink w:anchor="_Toc199803754" w:history="1">
             <w:r>
               <w:rPr>
-                <w:rStyle w:val="Hyperlink"/>
+                <w:rStyle w:val="Siuktni"/>
                 <w:rFonts w:ascii="Times New Roman" w:hAnsi="Times New Roman" w:cs="Times New Roman"/>
                 <w:noProof/>
                 <w:sz w:val="16"/>
@@ -2181,7 +2184,7 @@
         </w:p>
         <w:p>
           <w:pPr>
-            <w:pStyle w:val="TOC1"/>
+            <w:pStyle w:val="Mucluc1"/>
             <w:tabs>
               <w:tab w:val="right" w:leader="dot" w:pos="9350"/>
             </w:tabs>
@@ -2195,7 +2198,7 @@
           <w:hyperlink w:anchor="_Toc199803755" w:history="1">
             <w:r>
               <w:rPr>
-                <w:rStyle w:val="Hyperlink"/>
+                <w:rStyle w:val="Siuktni"/>
                 <w:rFonts w:ascii="Times New Roman" w:hAnsi="Times New Roman" w:cs="Times New Roman"/>
                 <w:noProof/>
                 <w:sz w:val="16"/>
@@ -2276,7 +2279,7 @@
         </w:p>
         <w:p>
           <w:pPr>
-            <w:pStyle w:val="TOC1"/>
+            <w:pStyle w:val="Mucluc1"/>
             <w:tabs>
               <w:tab w:val="right" w:leader="dot" w:pos="9350"/>
             </w:tabs>
@@ -2290,7 +2293,7 @@
           <w:hyperlink w:anchor="_Toc199803756" w:history="1">
             <w:r>
               <w:rPr>
-                <w:rStyle w:val="Hyperlink"/>
+                <w:rStyle w:val="Siuktni"/>
                 <w:rFonts w:ascii="Times New Roman" w:hAnsi="Times New Roman" w:cs="Times New Roman"/>
                 <w:noProof/>
                 <w:sz w:val="16"/>
@@ -2371,7 +2374,7 @@
         </w:p>
         <w:p>
           <w:pPr>
-            <w:pStyle w:val="TOC1"/>
+            <w:pStyle w:val="Mucluc1"/>
             <w:tabs>
               <w:tab w:val="right" w:leader="dot" w:pos="9350"/>
             </w:tabs>
@@ -2385,7 +2388,7 @@
           <w:hyperlink w:anchor="_Toc199803757" w:history="1">
             <w:r>
               <w:rPr>
-                <w:rStyle w:val="Hyperlink"/>
+                <w:rStyle w:val="Siuktni"/>
                 <w:rFonts w:ascii="Times New Roman" w:hAnsi="Times New Roman" w:cs="Times New Roman"/>
                 <w:noProof/>
                 <w:sz w:val="16"/>
@@ -2466,7 +2469,7 @@
         </w:p>
         <w:p>
           <w:pPr>
-            <w:pStyle w:val="TOC1"/>
+            <w:pStyle w:val="Mucluc1"/>
             <w:tabs>
               <w:tab w:val="right" w:leader="dot" w:pos="9350"/>
             </w:tabs>
@@ -2480,7 +2483,7 @@
           <w:hyperlink w:anchor="_Toc199803758" w:history="1">
             <w:r>
               <w:rPr>
-                <w:rStyle w:val="Hyperlink"/>
+                <w:rStyle w:val="Siuktni"/>
                 <w:rFonts w:ascii="Times New Roman" w:hAnsi="Times New Roman" w:cs="Times New Roman"/>
                 <w:noProof/>
                 <w:sz w:val="16"/>
@@ -2561,7 +2564,7 @@
         </w:p>
         <w:p>
           <w:pPr>
-            <w:pStyle w:val="TOC1"/>
+            <w:pStyle w:val="Mucluc1"/>
             <w:tabs>
               <w:tab w:val="right" w:leader="dot" w:pos="9350"/>
             </w:tabs>
@@ -2575,7 +2578,7 @@
           <w:hyperlink w:anchor="_Toc199803759" w:history="1">
             <w:r>
               <w:rPr>
-                <w:rStyle w:val="Hyperlink"/>
+                <w:rStyle w:val="Siuktni"/>
                 <w:rFonts w:ascii="Times New Roman" w:hAnsi="Times New Roman" w:cs="Times New Roman"/>
                 <w:noProof/>
                 <w:sz w:val="16"/>
@@ -2656,7 +2659,7 @@
         </w:p>
         <w:p>
           <w:pPr>
-            <w:pStyle w:val="TOC1"/>
+            <w:pStyle w:val="Mucluc1"/>
             <w:tabs>
               <w:tab w:val="right" w:leader="dot" w:pos="9350"/>
             </w:tabs>
@@ -2670,7 +2673,7 @@
           <w:hyperlink w:anchor="_Toc199803760" w:history="1">
             <w:r>
               <w:rPr>
-                <w:rStyle w:val="Hyperlink"/>
+                <w:rStyle w:val="Siuktni"/>
                 <w:rFonts w:ascii="Times New Roman" w:hAnsi="Times New Roman" w:cs="Times New Roman"/>
                 <w:noProof/>
                 <w:sz w:val="16"/>
@@ -2751,7 +2754,7 @@
         </w:p>
         <w:p>
           <w:pPr>
-            <w:pStyle w:val="TOC1"/>
+            <w:pStyle w:val="Mucluc1"/>
             <w:tabs>
               <w:tab w:val="right" w:leader="dot" w:pos="9350"/>
             </w:tabs>
@@ -2765,7 +2768,7 @@
           <w:hyperlink w:anchor="_Toc199803761" w:history="1">
             <w:r>
               <w:rPr>
-                <w:rStyle w:val="Hyperlink"/>
+                <w:rStyle w:val="Siuktni"/>
                 <w:rFonts w:ascii="Times New Roman" w:hAnsi="Times New Roman" w:cs="Times New Roman"/>
                 <w:noProof/>
                 <w:sz w:val="16"/>
@@ -2846,7 +2849,7 @@
         </w:p>
         <w:p>
           <w:pPr>
-            <w:pStyle w:val="TOC1"/>
+            <w:pStyle w:val="Mucluc1"/>
             <w:tabs>
               <w:tab w:val="right" w:leader="dot" w:pos="9350"/>
             </w:tabs>
@@ -2860,7 +2863,7 @@
           <w:hyperlink w:anchor="_Toc199803762" w:history="1">
             <w:r>
               <w:rPr>
-                <w:rStyle w:val="Hyperlink"/>
+                <w:rStyle w:val="Siuktni"/>
                 <w:rFonts w:ascii="Times New Roman" w:hAnsi="Times New Roman" w:cs="Times New Roman"/>
                 <w:noProof/>
                 <w:sz w:val="16"/>
@@ -2941,7 +2944,7 @@
         </w:p>
         <w:p>
           <w:pPr>
-            <w:pStyle w:val="TOC1"/>
+            <w:pStyle w:val="Mucluc1"/>
             <w:tabs>
               <w:tab w:val="right" w:leader="dot" w:pos="9350"/>
             </w:tabs>
@@ -2955,7 +2958,7 @@
           <w:hyperlink w:anchor="_Toc199803763" w:history="1">
             <w:r>
               <w:rPr>
-                <w:rStyle w:val="Hyperlink"/>
+                <w:rStyle w:val="Siuktni"/>
                 <w:rFonts w:ascii="Times New Roman" w:hAnsi="Times New Roman" w:cs="Times New Roman"/>
                 <w:noProof/>
                 <w:sz w:val="16"/>
@@ -3058,7 +3061,7 @@
     </w:sdt>
     <w:p>
       <w:pPr>
-        <w:pStyle w:val="Heading1"/>
+        <w:pStyle w:val="u1"/>
         <w:rPr>
           <w:rFonts w:ascii="Times New Roman" w:hAnsi="Times New Roman" w:cs="Times New Roman"/>
           <w:color w:val="auto"/>
@@ -3106,7 +3109,27 @@
           <w:sz w:val="16"/>
           <w:szCs w:val="16"/>
         </w:rPr>
-        <w:t xml:space="preserve"> các </w:t>
+        <w:t xml:space="preserve"> </w:t>
+      </w:r>
+      <w:proofErr w:type="spellStart"/>
+      <w:r>
+        <w:rPr>
+          <w:rFonts w:ascii="Times New Roman" w:hAnsi="Times New Roman" w:cs="Times New Roman"/>
+          <w:color w:val="auto"/>
+          <w:sz w:val="16"/>
+          <w:szCs w:val="16"/>
+        </w:rPr>
+        <w:t>các</w:t>
+      </w:r>
+      <w:proofErr w:type="spellEnd"/>
+      <w:r>
+        <w:rPr>
+          <w:rFonts w:ascii="Times New Roman" w:hAnsi="Times New Roman" w:cs="Times New Roman"/>
+          <w:color w:val="auto"/>
+          <w:sz w:val="16"/>
+          <w:szCs w:val="16"/>
+        </w:rPr>
+        <w:t xml:space="preserve"> </w:t>
       </w:r>
       <w:proofErr w:type="spellStart"/>
       <w:r>
@@ -3252,7 +3275,7 @@
     </w:p>
     <w:p>
       <w:pPr>
-        <w:pStyle w:val="Heading1"/>
+        <w:pStyle w:val="u1"/>
         <w:rPr>
           <w:rFonts w:ascii="Times New Roman" w:hAnsi="Times New Roman" w:cs="Times New Roman"/>
           <w:color w:val="auto"/>
@@ -3427,7 +3450,7 @@
       <w:bookmarkStart w:id="2" w:name="_Toc199803735"/>
       <w:r>
         <w:rPr>
-          <w:rStyle w:val="Heading1Char"/>
+          <w:rStyle w:val="u1Char"/>
           <w:rFonts w:ascii="Times New Roman" w:hAnsi="Times New Roman" w:cs="Times New Roman"/>
           <w:color w:val="auto"/>
           <w:sz w:val="16"/>
@@ -3947,7 +3970,7 @@
       <w:bookmarkStart w:id="3" w:name="_Toc199803736"/>
       <w:r>
         <w:rPr>
-          <w:rStyle w:val="Heading1Char"/>
+          <w:rStyle w:val="u1Char"/>
           <w:rFonts w:ascii="Times New Roman" w:hAnsi="Times New Roman" w:cs="Times New Roman"/>
           <w:color w:val="auto"/>
           <w:sz w:val="16"/>
@@ -4609,7 +4632,7 @@
     </w:p>
     <w:p>
       <w:pPr>
-        <w:pStyle w:val="Heading1"/>
+        <w:pStyle w:val="u1"/>
         <w:rPr>
           <w:rFonts w:ascii="Times New Roman" w:hAnsi="Times New Roman" w:cs="Times New Roman"/>
           <w:color w:val="auto"/>
@@ -5006,7 +5029,7 @@
     </w:p>
     <w:p>
       <w:pPr>
-        <w:pStyle w:val="Heading1"/>
+        <w:pStyle w:val="u1"/>
         <w:rPr>
           <w:rFonts w:ascii="Times New Roman" w:hAnsi="Times New Roman" w:cs="Times New Roman"/>
           <w:color w:val="auto"/>
@@ -5891,7 +5914,7 @@
     </w:p>
     <w:p>
       <w:pPr>
-        <w:pStyle w:val="Heading1"/>
+        <w:pStyle w:val="u1"/>
         <w:rPr>
           <w:rFonts w:ascii="Times New Roman" w:hAnsi="Times New Roman" w:cs="Times New Roman"/>
           <w:color w:val="auto"/>
@@ -7130,7 +7153,7 @@
     </w:p>
     <w:p>
       <w:pPr>
-        <w:pStyle w:val="Heading1"/>
+        <w:pStyle w:val="u1"/>
         <w:rPr>
           <w:rFonts w:ascii="Times New Roman" w:hAnsi="Times New Roman" w:cs="Times New Roman"/>
           <w:color w:val="auto"/>
@@ -8047,7 +8070,7 @@
     </w:p>
     <w:p>
       <w:pPr>
-        <w:pStyle w:val="Heading1"/>
+        <w:pStyle w:val="u1"/>
         <w:rPr>
           <w:rFonts w:ascii="Times New Roman" w:hAnsi="Times New Roman" w:cs="Times New Roman"/>
           <w:color w:val="auto"/>
@@ -9043,7 +9066,7 @@
     </w:p>
     <w:p>
       <w:pPr>
-        <w:pStyle w:val="Heading1"/>
+        <w:pStyle w:val="u1"/>
         <w:rPr>
           <w:rFonts w:ascii="Times New Roman" w:hAnsi="Times New Roman" w:cs="Times New Roman"/>
           <w:color w:val="auto"/>
@@ -10042,7 +10065,7 @@
     </w:p>
     <w:p>
       <w:pPr>
-        <w:pStyle w:val="Heading1"/>
+        <w:pStyle w:val="u1"/>
         <w:rPr>
           <w:rFonts w:ascii="Times New Roman" w:hAnsi="Times New Roman" w:cs="Times New Roman"/>
           <w:color w:val="auto"/>
@@ -10918,7 +10941,7 @@
     </w:p>
     <w:p>
       <w:pPr>
-        <w:pStyle w:val="Heading1"/>
+        <w:pStyle w:val="u1"/>
         <w:rPr>
           <w:rFonts w:ascii="Times New Roman" w:hAnsi="Times New Roman" w:cs="Times New Roman"/>
           <w:color w:val="auto"/>
@@ -13477,7 +13500,7 @@
     </w:p>
     <w:p>
       <w:pPr>
-        <w:pStyle w:val="Heading1"/>
+        <w:pStyle w:val="u1"/>
         <w:rPr>
           <w:rFonts w:ascii="Times New Roman" w:hAnsi="Times New Roman" w:cs="Times New Roman"/>
           <w:color w:val="auto"/>
@@ -14583,6 +14606,7 @@
       <w:r>
         <w:rPr>
           <w:rFonts w:ascii="Times New Roman" w:hAnsi="Times New Roman" w:cs="Times New Roman"/>
+          <w:noProof/>
           <w:sz w:val="16"/>
           <w:szCs w:val="16"/>
         </w:rPr>
@@ -14780,7 +14804,7 @@
     </w:p>
     <w:p>
       <w:pPr>
-        <w:pStyle w:val="Heading1"/>
+        <w:pStyle w:val="u1"/>
         <w:rPr>
           <w:rFonts w:ascii="Times New Roman" w:hAnsi="Times New Roman" w:cs="Times New Roman"/>
           <w:color w:val="auto"/>
@@ -17488,7 +17512,7 @@
     </w:p>
     <w:p>
       <w:pPr>
-        <w:pStyle w:val="Heading1"/>
+        <w:pStyle w:val="u1"/>
         <w:rPr>
           <w:rFonts w:ascii="Times New Roman" w:hAnsi="Times New Roman" w:cs="Times New Roman"/>
           <w:color w:val="auto"/>
@@ -19186,7 +19210,7 @@
     </w:p>
     <w:p>
       <w:pPr>
-        <w:pStyle w:val="Heading1"/>
+        <w:pStyle w:val="u1"/>
         <w:rPr>
           <w:rFonts w:ascii="Times New Roman" w:hAnsi="Times New Roman" w:cs="Times New Roman"/>
           <w:color w:val="auto"/>
@@ -21431,7 +21455,7 @@
     </w:p>
     <w:p>
       <w:pPr>
-        <w:pStyle w:val="Heading1"/>
+        <w:pStyle w:val="u1"/>
         <w:rPr>
           <w:rFonts w:ascii="Times New Roman" w:hAnsi="Times New Roman" w:cs="Times New Roman"/>
           <w:color w:val="auto"/>
@@ -23062,7 +23086,7 @@
     </w:p>
     <w:p>
       <w:pPr>
-        <w:pStyle w:val="Heading1"/>
+        <w:pStyle w:val="u1"/>
         <w:rPr>
           <w:rFonts w:ascii="Times New Roman" w:hAnsi="Times New Roman" w:cs="Times New Roman"/>
           <w:color w:val="auto"/>
@@ -25078,7 +25102,7 @@
     </w:p>
     <w:p>
       <w:pPr>
-        <w:pStyle w:val="Heading1"/>
+        <w:pStyle w:val="u1"/>
         <w:rPr>
           <w:rFonts w:ascii="Times New Roman" w:hAnsi="Times New Roman" w:cs="Times New Roman"/>
           <w:color w:val="auto"/>
@@ -27466,7 +27490,7 @@
     </w:p>
     <w:p>
       <w:pPr>
-        <w:pStyle w:val="Heading1"/>
+        <w:pStyle w:val="u1"/>
         <w:rPr>
           <w:rFonts w:ascii="Times New Roman" w:hAnsi="Times New Roman" w:cs="Times New Roman"/>
           <w:color w:val="auto"/>
@@ -30032,7 +30056,7 @@
     </w:p>
     <w:p>
       <w:pPr>
-        <w:pStyle w:val="Heading1"/>
+        <w:pStyle w:val="u1"/>
         <w:rPr>
           <w:rFonts w:ascii="Times New Roman" w:hAnsi="Times New Roman" w:cs="Times New Roman"/>
           <w:color w:val="auto"/>
@@ -31650,7 +31674,7 @@
     </w:p>
     <w:p>
       <w:pPr>
-        <w:pStyle w:val="Heading1"/>
+        <w:pStyle w:val="u1"/>
         <w:rPr>
           <w:rFonts w:ascii="Times New Roman" w:hAnsi="Times New Roman" w:cs="Times New Roman"/>
           <w:color w:val="auto"/>
@@ -31734,7 +31758,7 @@
     </w:p>
     <w:p>
       <w:pPr>
-        <w:pStyle w:val="Heading1"/>
+        <w:pStyle w:val="u1"/>
         <w:rPr>
           <w:rFonts w:ascii="Times New Roman" w:hAnsi="Times New Roman" w:cs="Times New Roman"/>
           <w:color w:val="auto"/>
@@ -32318,7 +32342,7 @@
     </w:p>
     <w:p>
       <w:pPr>
-        <w:pStyle w:val="Heading1"/>
+        <w:pStyle w:val="u1"/>
         <w:rPr>
           <w:rFonts w:ascii="Times New Roman" w:hAnsi="Times New Roman" w:cs="Times New Roman"/>
           <w:color w:val="auto"/>
@@ -32756,7 +32780,7 @@
     </w:p>
     <w:p>
       <w:pPr>
-        <w:pStyle w:val="Heading1"/>
+        <w:pStyle w:val="u1"/>
         <w:rPr>
           <w:rFonts w:ascii="Times New Roman" w:hAnsi="Times New Roman" w:cs="Times New Roman"/>
           <w:color w:val="auto"/>
@@ -32928,7 +32952,7 @@
     </w:p>
     <w:p>
       <w:pPr>
-        <w:pStyle w:val="Heading1"/>
+        <w:pStyle w:val="u1"/>
         <w:rPr>
           <w:rFonts w:ascii="Times New Roman" w:hAnsi="Times New Roman" w:cs="Times New Roman"/>
           <w:color w:val="auto"/>
@@ -33136,7 +33160,7 @@
     </w:p>
     <w:p>
       <w:pPr>
-        <w:pStyle w:val="Heading1"/>
+        <w:pStyle w:val="u1"/>
         <w:rPr>
           <w:rFonts w:ascii="Times New Roman" w:hAnsi="Times New Roman" w:cs="Times New Roman"/>
           <w:color w:val="auto"/>
@@ -33444,7 +33468,7 @@
     </w:p>
     <w:p>
       <w:pPr>
-        <w:pStyle w:val="Heading1"/>
+        <w:pStyle w:val="u1"/>
         <w:rPr>
           <w:rFonts w:ascii="Times New Roman" w:hAnsi="Times New Roman" w:cs="Times New Roman"/>
           <w:color w:val="auto"/>
@@ -33678,7 +33702,7 @@
     </w:p>
     <w:p>
       <w:pPr>
-        <w:pStyle w:val="Heading1"/>
+        <w:pStyle w:val="u1"/>
         <w:rPr>
           <w:rFonts w:ascii="Times New Roman" w:hAnsi="Times New Roman" w:cs="Times New Roman"/>
           <w:color w:val="auto"/>
@@ -33830,7 +33854,7 @@
     </w:p>
     <w:p>
       <w:pPr>
-        <w:pStyle w:val="Heading1"/>
+        <w:pStyle w:val="u1"/>
         <w:rPr>
           <w:rFonts w:ascii="Times New Roman" w:hAnsi="Times New Roman" w:cs="Times New Roman"/>
           <w:color w:val="auto"/>
@@ -33946,7 +33970,7 @@
     </w:p>
     <w:p>
       <w:pPr>
-        <w:pStyle w:val="Heading1"/>
+        <w:pStyle w:val="u1"/>
         <w:rPr>
           <w:rFonts w:ascii="Times New Roman" w:hAnsi="Times New Roman" w:cs="Times New Roman"/>
           <w:color w:val="auto"/>
@@ -34130,7 +34154,7 @@
 </file>
 
 <file path=word/endnotes.xml><?xml version="1.0" encoding="utf-8"?>
-<w:endnotes xmlns:wpc="http://schemas.microsoft.com/office/word/2010/wordprocessingCanvas" xmlns:cx="http://schemas.microsoft.com/office/drawing/2014/chartex" xmlns:cx1="http://schemas.microsoft.com/office/drawing/2015/9/8/chartex" xmlns:cx2="http://schemas.microsoft.com/office/drawing/2015/10/21/chartex" xmlns:cx3="http://schemas.microsoft.com/office/drawing/2016/5/9/chartex" xmlns:cx4="http://schemas.microsoft.com/office/drawing/2016/5/10/chartex" xmlns:cx5="http://schemas.microsoft.com/office/drawing/2016/5/11/chartex" xmlns:cx6="http://schemas.microsoft.com/office/drawing/2016/5/12/chartex" xmlns:cx7="http://schemas.microsoft.com/office/drawing/2016/5/13/chartex" xmlns:cx8="http://schemas.microsoft.com/office/drawing/2016/5/14/chartex" xmlns:mc="http://schemas.openxmlformats.org/markup-compatibility/2006" xmlns:aink="http://schemas.microsoft.com/office/drawing/2016/ink" xmlns:am3d="http://schemas.microsoft.com/office/drawing/2017/model3d" xmlns:o="urn:schemas-microsoft-com:office:office" xmlns:oel="http://schemas.microsoft.com/office/2019/extlst" xmlns:r="http://schemas.openxmlformats.org/officeDocument/2006/relationships" xmlns:m="http://schemas.openxmlformats.org/officeDocument/2006/math" xmlns:v="urn:schemas-microsoft-com:vml" xmlns:wp14="http://schemas.microsoft.com/office/word/2010/wordprocessingDrawing" xmlns:wp="http://schemas.openxmlformats.org/drawingml/2006/wordprocessingDrawing" xmlns:w10="urn:schemas-microsoft-com:office:word" xmlns:w="http://schemas.openxmlformats.org/wordprocessingml/2006/main" xmlns:w14="http://schemas.microsoft.com/office/word/2010/wordml" xmlns:w15="http://schemas.microsoft.com/office/word/2012/wordml" xmlns:w16cex="http://schemas.microsoft.com/office/word/2018/wordml/cex" xmlns:w16cid="http://schemas.microsoft.com/office/word/2016/wordml/cid" xmlns:w16="http://schemas.microsoft.com/office/word/2018/wordml" xmlns:w16du="http://schemas.microsoft.com/office/word/2023/wordml/word16du" xmlns:w16sdtdh="http://schemas.microsoft.com/office/word/2020/wordml/sdtdatahash" xmlns:w16sdtfl="http://schemas.microsoft.com/office/word/2024/wordml/sdtformatlock" xmlns:w16se="http://schemas.microsoft.com/office/word/2015/wordml/symex" xmlns:wpg="http://schemas.microsoft.com/office/word/2010/wordprocessingGroup" xmlns:wpi="http://schemas.microsoft.com/office/word/2010/wordprocessingInk" xmlns:wne="http://schemas.microsoft.com/office/word/2006/wordml" xmlns:wps="http://schemas.microsoft.com/office/word/2010/wordprocessingShape" mc:Ignorable="w14 w15 w16se w16cid w16 w16cex w16sdtdh w16sdtfl w16du wp14">
+<w:endnotes xmlns:wpc="http://schemas.microsoft.com/office/word/2010/wordprocessingCanvas" xmlns:cx="http://schemas.microsoft.com/office/drawing/2014/chartex" xmlns:cx1="http://schemas.microsoft.com/office/drawing/2015/9/8/chartex" xmlns:cx2="http://schemas.microsoft.com/office/drawing/2015/10/21/chartex" xmlns:cx3="http://schemas.microsoft.com/office/drawing/2016/5/9/chartex" xmlns:cx4="http://schemas.microsoft.com/office/drawing/2016/5/10/chartex" xmlns:cx5="http://schemas.microsoft.com/office/drawing/2016/5/11/chartex" xmlns:cx6="http://schemas.microsoft.com/office/drawing/2016/5/12/chartex" xmlns:cx7="http://schemas.microsoft.com/office/drawing/2016/5/13/chartex" xmlns:cx8="http://schemas.microsoft.com/office/drawing/2016/5/14/chartex" xmlns:mc="http://schemas.openxmlformats.org/markup-compatibility/2006" xmlns:aink="http://schemas.microsoft.com/office/drawing/2016/ink" xmlns:am3d="http://schemas.microsoft.com/office/drawing/2017/model3d" xmlns:o="urn:schemas-microsoft-com:office:office" xmlns:oel="http://schemas.microsoft.com/office/2019/extlst" xmlns:r="http://schemas.openxmlformats.org/officeDocument/2006/relationships" xmlns:m="http://schemas.openxmlformats.org/officeDocument/2006/math" xmlns:v="urn:schemas-microsoft-com:vml" xmlns:wp14="http://schemas.microsoft.com/office/word/2010/wordprocessingDrawing" xmlns:wp="http://schemas.openxmlformats.org/drawingml/2006/wordprocessingDrawing" xmlns:w10="urn:schemas-microsoft-com:office:word" xmlns:w="http://schemas.openxmlformats.org/wordprocessingml/2006/main" xmlns:w14="http://schemas.microsoft.com/office/word/2010/wordml" xmlns:w15="http://schemas.microsoft.com/office/word/2012/wordml" xmlns:w16cex="http://schemas.microsoft.com/office/word/2018/wordml/cex" xmlns:w16cid="http://schemas.microsoft.com/office/word/2016/wordml/cid" xmlns:w16="http://schemas.microsoft.com/office/word/2018/wordml" xmlns:w16sdtdh="http://schemas.microsoft.com/office/word/2020/wordml/sdtdatahash" xmlns:w16se="http://schemas.microsoft.com/office/word/2015/wordml/symex" xmlns:wpg="http://schemas.microsoft.com/office/word/2010/wordprocessingGroup" xmlns:wpi="http://schemas.microsoft.com/office/word/2010/wordprocessingInk" xmlns:wne="http://schemas.microsoft.com/office/word/2006/wordml" xmlns:wps="http://schemas.microsoft.com/office/word/2010/wordprocessingShape" mc:Ignorable="w14 w15 w16se w16cid w16 w16cex w16sdtdh wp14">
   <w:endnote w:type="separator" w:id="-1">
     <w:p>
       <w:pPr>
@@ -34155,7 +34179,7 @@
 </file>
 
 <file path=word/footer1.xml><?xml version="1.0" encoding="utf-8"?>
-<w:ftr xmlns:wpc="http://schemas.microsoft.com/office/word/2010/wordprocessingCanvas" xmlns:cx="http://schemas.microsoft.com/office/drawing/2014/chartex" xmlns:cx1="http://schemas.microsoft.com/office/drawing/2015/9/8/chartex" xmlns:cx2="http://schemas.microsoft.com/office/drawing/2015/10/21/chartex" xmlns:cx3="http://schemas.microsoft.com/office/drawing/2016/5/9/chartex" xmlns:cx4="http://schemas.microsoft.com/office/drawing/2016/5/10/chartex" xmlns:cx5="http://schemas.microsoft.com/office/drawing/2016/5/11/chartex" xmlns:cx6="http://schemas.microsoft.com/office/drawing/2016/5/12/chartex" xmlns:cx7="http://schemas.microsoft.com/office/drawing/2016/5/13/chartex" xmlns:cx8="http://schemas.microsoft.com/office/drawing/2016/5/14/chartex" xmlns:mc="http://schemas.openxmlformats.org/markup-compatibility/2006" xmlns:aink="http://schemas.microsoft.com/office/drawing/2016/ink" xmlns:am3d="http://schemas.microsoft.com/office/drawing/2017/model3d" xmlns:o="urn:schemas-microsoft-com:office:office" xmlns:oel="http://schemas.microsoft.com/office/2019/extlst" xmlns:r="http://schemas.openxmlformats.org/officeDocument/2006/relationships" xmlns:m="http://schemas.openxmlformats.org/officeDocument/2006/math" xmlns:v="urn:schemas-microsoft-com:vml" xmlns:wp14="http://schemas.microsoft.com/office/word/2010/wordprocessingDrawing" xmlns:wp="http://schemas.openxmlformats.org/drawingml/2006/wordprocessingDrawing" xmlns:w10="urn:schemas-microsoft-com:office:word" xmlns:w="http://schemas.openxmlformats.org/wordprocessingml/2006/main" xmlns:w14="http://schemas.microsoft.com/office/word/2010/wordml" xmlns:w15="http://schemas.microsoft.com/office/word/2012/wordml" xmlns:w16cex="http://schemas.microsoft.com/office/word/2018/wordml/cex" xmlns:w16cid="http://schemas.microsoft.com/office/word/2016/wordml/cid" xmlns:w16="http://schemas.microsoft.com/office/word/2018/wordml" xmlns:w16du="http://schemas.microsoft.com/office/word/2023/wordml/word16du" xmlns:w16sdtdh="http://schemas.microsoft.com/office/word/2020/wordml/sdtdatahash" xmlns:w16sdtfl="http://schemas.microsoft.com/office/word/2024/wordml/sdtformatlock" xmlns:w16se="http://schemas.microsoft.com/office/word/2015/wordml/symex" xmlns:wpg="http://schemas.microsoft.com/office/word/2010/wordprocessingGroup" xmlns:wpi="http://schemas.microsoft.com/office/word/2010/wordprocessingInk" xmlns:wne="http://schemas.microsoft.com/office/word/2006/wordml" xmlns:wps="http://schemas.microsoft.com/office/word/2010/wordprocessingShape" mc:Ignorable="w14 w15 w16se w16cid w16 w16cex w16sdtdh w16sdtfl w16du wp14">
+<w:ftr xmlns:wpc="http://schemas.microsoft.com/office/word/2010/wordprocessingCanvas" xmlns:cx="http://schemas.microsoft.com/office/drawing/2014/chartex" xmlns:cx1="http://schemas.microsoft.com/office/drawing/2015/9/8/chartex" xmlns:cx2="http://schemas.microsoft.com/office/drawing/2015/10/21/chartex" xmlns:cx3="http://schemas.microsoft.com/office/drawing/2016/5/9/chartex" xmlns:cx4="http://schemas.microsoft.com/office/drawing/2016/5/10/chartex" xmlns:cx5="http://schemas.microsoft.com/office/drawing/2016/5/11/chartex" xmlns:cx6="http://schemas.microsoft.com/office/drawing/2016/5/12/chartex" xmlns:cx7="http://schemas.microsoft.com/office/drawing/2016/5/13/chartex" xmlns:cx8="http://schemas.microsoft.com/office/drawing/2016/5/14/chartex" xmlns:mc="http://schemas.openxmlformats.org/markup-compatibility/2006" xmlns:aink="http://schemas.microsoft.com/office/drawing/2016/ink" xmlns:am3d="http://schemas.microsoft.com/office/drawing/2017/model3d" xmlns:o="urn:schemas-microsoft-com:office:office" xmlns:oel="http://schemas.microsoft.com/office/2019/extlst" xmlns:r="http://schemas.openxmlformats.org/officeDocument/2006/relationships" xmlns:m="http://schemas.openxmlformats.org/officeDocument/2006/math" xmlns:v="urn:schemas-microsoft-com:vml" xmlns:wp14="http://schemas.microsoft.com/office/word/2010/wordprocessingDrawing" xmlns:wp="http://schemas.openxmlformats.org/drawingml/2006/wordprocessingDrawing" xmlns:w10="urn:schemas-microsoft-com:office:word" xmlns:w="http://schemas.openxmlformats.org/wordprocessingml/2006/main" xmlns:w14="http://schemas.microsoft.com/office/word/2010/wordml" xmlns:w15="http://schemas.microsoft.com/office/word/2012/wordml" xmlns:w16cex="http://schemas.microsoft.com/office/word/2018/wordml/cex" xmlns:w16cid="http://schemas.microsoft.com/office/word/2016/wordml/cid" xmlns:w16="http://schemas.microsoft.com/office/word/2018/wordml" xmlns:w16sdtdh="http://schemas.microsoft.com/office/word/2020/wordml/sdtdatahash" xmlns:w16se="http://schemas.microsoft.com/office/word/2015/wordml/symex" xmlns:wpg="http://schemas.microsoft.com/office/word/2010/wordprocessingGroup" xmlns:wpi="http://schemas.microsoft.com/office/word/2010/wordprocessingInk" xmlns:wne="http://schemas.microsoft.com/office/word/2006/wordml" xmlns:wps="http://schemas.microsoft.com/office/word/2010/wordprocessingShape" mc:Ignorable="w14 w15 w16se w16cid w16 w16cex w16sdtdh wp14">
   <w:sdt>
     <w:sdtPr>
       <w:id w:val="-1484619411"/>
@@ -34172,7 +34196,7 @@
     <w:sdtContent>
       <w:p>
         <w:pPr>
-          <w:pStyle w:val="Footer"/>
+          <w:pStyle w:val="Chntrang"/>
           <w:jc w:val="center"/>
         </w:pPr>
         <w:r>
@@ -34201,14 +34225,14 @@
   </w:sdt>
   <w:p>
     <w:pPr>
-      <w:pStyle w:val="Footer"/>
+      <w:pStyle w:val="Chntrang"/>
     </w:pPr>
   </w:p>
 </w:ftr>
 </file>
 
 <file path=word/footnotes.xml><?xml version="1.0" encoding="utf-8"?>
-<w:footnotes xmlns:wpc="http://schemas.microsoft.com/office/word/2010/wordprocessingCanvas" xmlns:cx="http://schemas.microsoft.com/office/drawing/2014/chartex" xmlns:cx1="http://schemas.microsoft.com/office/drawing/2015/9/8/chartex" xmlns:cx2="http://schemas.microsoft.com/office/drawing/2015/10/21/chartex" xmlns:cx3="http://schemas.microsoft.com/office/drawing/2016/5/9/chartex" xmlns:cx4="http://schemas.microsoft.com/office/drawing/2016/5/10/chartex" xmlns:cx5="http://schemas.microsoft.com/office/drawing/2016/5/11/chartex" xmlns:cx6="http://schemas.microsoft.com/office/drawing/2016/5/12/chartex" xmlns:cx7="http://schemas.microsoft.com/office/drawing/2016/5/13/chartex" xmlns:cx8="http://schemas.microsoft.com/office/drawing/2016/5/14/chartex" xmlns:mc="http://schemas.openxmlformats.org/markup-compatibility/2006" xmlns:aink="http://schemas.microsoft.com/office/drawing/2016/ink" xmlns:am3d="http://schemas.microsoft.com/office/drawing/2017/model3d" xmlns:o="urn:schemas-microsoft-com:office:office" xmlns:oel="http://schemas.microsoft.com/office/2019/extlst" xmlns:r="http://schemas.openxmlformats.org/officeDocument/2006/relationships" xmlns:m="http://schemas.openxmlformats.org/officeDocument/2006/math" xmlns:v="urn:schemas-microsoft-com:vml" xmlns:wp14="http://schemas.microsoft.com/office/word/2010/wordprocessingDrawing" xmlns:wp="http://schemas.openxmlformats.org/drawingml/2006/wordprocessingDrawing" xmlns:w10="urn:schemas-microsoft-com:office:word" xmlns:w="http://schemas.openxmlformats.org/wordprocessingml/2006/main" xmlns:w14="http://schemas.microsoft.com/office/word/2010/wordml" xmlns:w15="http://schemas.microsoft.com/office/word/2012/wordml" xmlns:w16cex="http://schemas.microsoft.com/office/word/2018/wordml/cex" xmlns:w16cid="http://schemas.microsoft.com/office/word/2016/wordml/cid" xmlns:w16="http://schemas.microsoft.com/office/word/2018/wordml" xmlns:w16du="http://schemas.microsoft.com/office/word/2023/wordml/word16du" xmlns:w16sdtdh="http://schemas.microsoft.com/office/word/2020/wordml/sdtdatahash" xmlns:w16sdtfl="http://schemas.microsoft.com/office/word/2024/wordml/sdtformatlock" xmlns:w16se="http://schemas.microsoft.com/office/word/2015/wordml/symex" xmlns:wpg="http://schemas.microsoft.com/office/word/2010/wordprocessingGroup" xmlns:wpi="http://schemas.microsoft.com/office/word/2010/wordprocessingInk" xmlns:wne="http://schemas.microsoft.com/office/word/2006/wordml" xmlns:wps="http://schemas.microsoft.com/office/word/2010/wordprocessingShape" mc:Ignorable="w14 w15 w16se w16cid w16 w16cex w16sdtdh w16sdtfl w16du wp14">
+<w:footnotes xmlns:wpc="http://schemas.microsoft.com/office/word/2010/wordprocessingCanvas" xmlns:cx="http://schemas.microsoft.com/office/drawing/2014/chartex" xmlns:cx1="http://schemas.microsoft.com/office/drawing/2015/9/8/chartex" xmlns:cx2="http://schemas.microsoft.com/office/drawing/2015/10/21/chartex" xmlns:cx3="http://schemas.microsoft.com/office/drawing/2016/5/9/chartex" xmlns:cx4="http://schemas.microsoft.com/office/drawing/2016/5/10/chartex" xmlns:cx5="http://schemas.microsoft.com/office/drawing/2016/5/11/chartex" xmlns:cx6="http://schemas.microsoft.com/office/drawing/2016/5/12/chartex" xmlns:cx7="http://schemas.microsoft.com/office/drawing/2016/5/13/chartex" xmlns:cx8="http://schemas.microsoft.com/office/drawing/2016/5/14/chartex" xmlns:mc="http://schemas.openxmlformats.org/markup-compatibility/2006" xmlns:aink="http://schemas.microsoft.com/office/drawing/2016/ink" xmlns:am3d="http://schemas.microsoft.com/office/drawing/2017/model3d" xmlns:o="urn:schemas-microsoft-com:office:office" xmlns:oel="http://schemas.microsoft.com/office/2019/extlst" xmlns:r="http://schemas.openxmlformats.org/officeDocument/2006/relationships" xmlns:m="http://schemas.openxmlformats.org/officeDocument/2006/math" xmlns:v="urn:schemas-microsoft-com:vml" xmlns:wp14="http://schemas.microsoft.com/office/word/2010/wordprocessingDrawing" xmlns:wp="http://schemas.openxmlformats.org/drawingml/2006/wordprocessingDrawing" xmlns:w10="urn:schemas-microsoft-com:office:word" xmlns:w="http://schemas.openxmlformats.org/wordprocessingml/2006/main" xmlns:w14="http://schemas.microsoft.com/office/word/2010/wordml" xmlns:w15="http://schemas.microsoft.com/office/word/2012/wordml" xmlns:w16cex="http://schemas.microsoft.com/office/word/2018/wordml/cex" xmlns:w16cid="http://schemas.microsoft.com/office/word/2016/wordml/cid" xmlns:w16="http://schemas.microsoft.com/office/word/2018/wordml" xmlns:w16sdtdh="http://schemas.microsoft.com/office/word/2020/wordml/sdtdatahash" xmlns:w16se="http://schemas.microsoft.com/office/word/2015/wordml/symex" xmlns:wpg="http://schemas.microsoft.com/office/word/2010/wordprocessingGroup" xmlns:wpi="http://schemas.microsoft.com/office/word/2010/wordprocessingInk" xmlns:wne="http://schemas.microsoft.com/office/word/2006/wordml" xmlns:wps="http://schemas.microsoft.com/office/word/2010/wordprocessingShape" mc:Ignorable="w14 w15 w16se w16cid w16 w16cex w16sdtdh wp14">
   <w:footnote w:type="separator" w:id="-1">
     <w:p>
       <w:pPr>
@@ -34233,22 +34257,22 @@
 </file>
 
 <file path=word/header1.xml><?xml version="1.0" encoding="utf-8"?>
-<w:hdr xmlns:wpc="http://schemas.microsoft.com/office/word/2010/wordprocessingCanvas" xmlns:cx="http://schemas.microsoft.com/office/drawing/2014/chartex" xmlns:cx1="http://schemas.microsoft.com/office/drawing/2015/9/8/chartex" xmlns:cx2="http://schemas.microsoft.com/office/drawing/2015/10/21/chartex" xmlns:cx3="http://schemas.microsoft.com/office/drawing/2016/5/9/chartex" xmlns:cx4="http://schemas.microsoft.com/office/drawing/2016/5/10/chartex" xmlns:cx5="http://schemas.microsoft.com/office/drawing/2016/5/11/chartex" xmlns:cx6="http://schemas.microsoft.com/office/drawing/2016/5/12/chartex" xmlns:cx7="http://schemas.microsoft.com/office/drawing/2016/5/13/chartex" xmlns:cx8="http://schemas.microsoft.com/office/drawing/2016/5/14/chartex" xmlns:mc="http://schemas.openxmlformats.org/markup-compatibility/2006" xmlns:aink="http://schemas.microsoft.com/office/drawing/2016/ink" xmlns:am3d="http://schemas.microsoft.com/office/drawing/2017/model3d" xmlns:o="urn:schemas-microsoft-com:office:office" xmlns:oel="http://schemas.microsoft.com/office/2019/extlst" xmlns:r="http://schemas.openxmlformats.org/officeDocument/2006/relationships" xmlns:m="http://schemas.openxmlformats.org/officeDocument/2006/math" xmlns:v="urn:schemas-microsoft-com:vml" xmlns:wp14="http://schemas.microsoft.com/office/word/2010/wordprocessingDrawing" xmlns:wp="http://schemas.openxmlformats.org/drawingml/2006/wordprocessingDrawing" xmlns:w10="urn:schemas-microsoft-com:office:word" xmlns:w="http://schemas.openxmlformats.org/wordprocessingml/2006/main" xmlns:w14="http://schemas.microsoft.com/office/word/2010/wordml" xmlns:w15="http://schemas.microsoft.com/office/word/2012/wordml" xmlns:w16cex="http://schemas.microsoft.com/office/word/2018/wordml/cex" xmlns:w16cid="http://schemas.microsoft.com/office/word/2016/wordml/cid" xmlns:w16="http://schemas.microsoft.com/office/word/2018/wordml" xmlns:w16du="http://schemas.microsoft.com/office/word/2023/wordml/word16du" xmlns:w16sdtdh="http://schemas.microsoft.com/office/word/2020/wordml/sdtdatahash" xmlns:w16sdtfl="http://schemas.microsoft.com/office/word/2024/wordml/sdtformatlock" xmlns:w16se="http://schemas.microsoft.com/office/word/2015/wordml/symex" xmlns:wpg="http://schemas.microsoft.com/office/word/2010/wordprocessingGroup" xmlns:wpi="http://schemas.microsoft.com/office/word/2010/wordprocessingInk" xmlns:wne="http://schemas.microsoft.com/office/word/2006/wordml" xmlns:wps="http://schemas.microsoft.com/office/word/2010/wordprocessingShape" mc:Ignorable="w14 w15 w16se w16cid w16 w16cex w16sdtdh w16sdtfl w16du wp14">
+<w:hdr xmlns:wpc="http://schemas.microsoft.com/office/word/2010/wordprocessingCanvas" xmlns:cx="http://schemas.microsoft.com/office/drawing/2014/chartex" xmlns:cx1="http://schemas.microsoft.com/office/drawing/2015/9/8/chartex" xmlns:cx2="http://schemas.microsoft.com/office/drawing/2015/10/21/chartex" xmlns:cx3="http://schemas.microsoft.com/office/drawing/2016/5/9/chartex" xmlns:cx4="http://schemas.microsoft.com/office/drawing/2016/5/10/chartex" xmlns:cx5="http://schemas.microsoft.com/office/drawing/2016/5/11/chartex" xmlns:cx6="http://schemas.microsoft.com/office/drawing/2016/5/12/chartex" xmlns:cx7="http://schemas.microsoft.com/office/drawing/2016/5/13/chartex" xmlns:cx8="http://schemas.microsoft.com/office/drawing/2016/5/14/chartex" xmlns:mc="http://schemas.openxmlformats.org/markup-compatibility/2006" xmlns:aink="http://schemas.microsoft.com/office/drawing/2016/ink" xmlns:am3d="http://schemas.microsoft.com/office/drawing/2017/model3d" xmlns:o="urn:schemas-microsoft-com:office:office" xmlns:oel="http://schemas.microsoft.com/office/2019/extlst" xmlns:r="http://schemas.openxmlformats.org/officeDocument/2006/relationships" xmlns:m="http://schemas.openxmlformats.org/officeDocument/2006/math" xmlns:v="urn:schemas-microsoft-com:vml" xmlns:wp14="http://schemas.microsoft.com/office/word/2010/wordprocessingDrawing" xmlns:wp="http://schemas.openxmlformats.org/drawingml/2006/wordprocessingDrawing" xmlns:w10="urn:schemas-microsoft-com:office:word" xmlns:w="http://schemas.openxmlformats.org/wordprocessingml/2006/main" xmlns:w14="http://schemas.microsoft.com/office/word/2010/wordml" xmlns:w15="http://schemas.microsoft.com/office/word/2012/wordml" xmlns:w16cex="http://schemas.microsoft.com/office/word/2018/wordml/cex" xmlns:w16cid="http://schemas.microsoft.com/office/word/2016/wordml/cid" xmlns:w16="http://schemas.microsoft.com/office/word/2018/wordml" xmlns:w16sdtdh="http://schemas.microsoft.com/office/word/2020/wordml/sdtdatahash" xmlns:w16se="http://schemas.microsoft.com/office/word/2015/wordml/symex" xmlns:wpg="http://schemas.microsoft.com/office/word/2010/wordprocessingGroup" xmlns:wpi="http://schemas.microsoft.com/office/word/2010/wordprocessingInk" xmlns:wne="http://schemas.microsoft.com/office/word/2006/wordml" xmlns:wps="http://schemas.microsoft.com/office/word/2010/wordprocessingShape" mc:Ignorable="w14 w15 w16se w16cid w16 w16cex w16sdtdh wp14">
   <w:p>
     <w:pPr>
-      <w:pStyle w:val="Header"/>
+      <w:pStyle w:val="utrang"/>
     </w:pPr>
   </w:p>
   <w:p>
     <w:pPr>
-      <w:pStyle w:val="Header"/>
+      <w:pStyle w:val="utrang"/>
     </w:pPr>
   </w:p>
 </w:hdr>
 </file>
 
 <file path=word/styles.xml><?xml version="1.0" encoding="utf-8"?>
-<w:styles xmlns:mc="http://schemas.openxmlformats.org/markup-compatibility/2006" xmlns:r="http://schemas.openxmlformats.org/officeDocument/2006/relationships" xmlns:w="http://schemas.openxmlformats.org/wordprocessingml/2006/main" xmlns:w14="http://schemas.microsoft.com/office/word/2010/wordml" xmlns:w15="http://schemas.microsoft.com/office/word/2012/wordml" xmlns:w16cex="http://schemas.microsoft.com/office/word/2018/wordml/cex" xmlns:w16cid="http://schemas.microsoft.com/office/word/2016/wordml/cid" xmlns:w16="http://schemas.microsoft.com/office/word/2018/wordml" xmlns:w16du="http://schemas.microsoft.com/office/word/2023/wordml/word16du" xmlns:w16sdtdh="http://schemas.microsoft.com/office/word/2020/wordml/sdtdatahash" xmlns:w16sdtfl="http://schemas.microsoft.com/office/word/2024/wordml/sdtformatlock" xmlns:w16se="http://schemas.microsoft.com/office/word/2015/wordml/symex" mc:Ignorable="w14 w15 w16se w16cid w16 w16cex w16sdtdh w16sdtfl w16du">
+<w:styles xmlns:mc="http://schemas.openxmlformats.org/markup-compatibility/2006" xmlns:r="http://schemas.openxmlformats.org/officeDocument/2006/relationships" xmlns:w="http://schemas.openxmlformats.org/wordprocessingml/2006/main" xmlns:w14="http://schemas.microsoft.com/office/word/2010/wordml" xmlns:w15="http://schemas.microsoft.com/office/word/2012/wordml" xmlns:w16cex="http://schemas.microsoft.com/office/word/2018/wordml/cex" xmlns:w16cid="http://schemas.microsoft.com/office/word/2016/wordml/cid" xmlns:w16="http://schemas.microsoft.com/office/word/2018/wordml" xmlns:w16sdtdh="http://schemas.microsoft.com/office/word/2020/wordml/sdtdatahash" xmlns:w16se="http://schemas.microsoft.com/office/word/2015/wordml/symex" mc:Ignorable="w14 w15 w16se w16cid w16 w16cex w16sdtdh">
   <w:docDefaults>
     <w:rPrDefault>
       <w:rPr>
@@ -34644,15 +34668,15 @@
     <w:lsdException w:name="Unresolved Mention" w:semiHidden="1" w:unhideWhenUsed="1"/>
     <w:lsdException w:name="Smart Link" w:semiHidden="1" w:unhideWhenUsed="1"/>
   </w:latentStyles>
-  <w:style w:type="paragraph" w:default="1" w:styleId="Normal">
+  <w:style w:type="paragraph" w:default="1" w:styleId="Binhthng">
     <w:name w:val="Normal"/>
     <w:qFormat/>
   </w:style>
-  <w:style w:type="paragraph" w:styleId="Heading1">
+  <w:style w:type="paragraph" w:styleId="u1">
     <w:name w:val="heading 1"/>
-    <w:basedOn w:val="Normal"/>
-    <w:next w:val="Normal"/>
-    <w:link w:val="Heading1Char"/>
+    <w:basedOn w:val="Binhthng"/>
+    <w:next w:val="Binhthng"/>
+    <w:link w:val="u1Char"/>
     <w:uiPriority w:val="9"/>
     <w:qFormat/>
     <w:rsid w:val="00C35CE0"/>
@@ -34669,11 +34693,11 @@
       <w:szCs w:val="40"/>
     </w:rPr>
   </w:style>
-  <w:style w:type="paragraph" w:styleId="Heading2">
+  <w:style w:type="paragraph" w:styleId="u2">
     <w:name w:val="heading 2"/>
-    <w:basedOn w:val="Normal"/>
-    <w:next w:val="Normal"/>
-    <w:link w:val="Heading2Char"/>
+    <w:basedOn w:val="Binhthng"/>
+    <w:next w:val="Binhthng"/>
+    <w:link w:val="u2Char"/>
     <w:uiPriority w:val="9"/>
     <w:unhideWhenUsed/>
     <w:qFormat/>
@@ -34691,11 +34715,11 @@
       <w:szCs w:val="32"/>
     </w:rPr>
   </w:style>
-  <w:style w:type="paragraph" w:styleId="Heading3">
+  <w:style w:type="paragraph" w:styleId="u3">
     <w:name w:val="heading 3"/>
-    <w:basedOn w:val="Normal"/>
-    <w:next w:val="Normal"/>
-    <w:link w:val="Heading3Char"/>
+    <w:basedOn w:val="Binhthng"/>
+    <w:next w:val="Binhthng"/>
+    <w:link w:val="u3Char"/>
     <w:uiPriority w:val="9"/>
     <w:semiHidden/>
     <w:unhideWhenUsed/>
@@ -34714,11 +34738,11 @@
       <w:szCs w:val="28"/>
     </w:rPr>
   </w:style>
-  <w:style w:type="paragraph" w:styleId="Heading4">
+  <w:style w:type="paragraph" w:styleId="u4">
     <w:name w:val="heading 4"/>
-    <w:basedOn w:val="Normal"/>
-    <w:next w:val="Normal"/>
-    <w:link w:val="Heading4Char"/>
+    <w:basedOn w:val="Binhthng"/>
+    <w:next w:val="Binhthng"/>
+    <w:link w:val="u4Char"/>
     <w:uiPriority w:val="9"/>
     <w:semiHidden/>
     <w:unhideWhenUsed/>
@@ -34737,11 +34761,11 @@
       <w:color w:val="2F5496" w:themeColor="accent1" w:themeShade="BF"/>
     </w:rPr>
   </w:style>
-  <w:style w:type="paragraph" w:styleId="Heading5">
+  <w:style w:type="paragraph" w:styleId="u5">
     <w:name w:val="heading 5"/>
-    <w:basedOn w:val="Normal"/>
-    <w:next w:val="Normal"/>
-    <w:link w:val="Heading5Char"/>
+    <w:basedOn w:val="Binhthng"/>
+    <w:next w:val="Binhthng"/>
+    <w:link w:val="u5Char"/>
     <w:uiPriority w:val="9"/>
     <w:semiHidden/>
     <w:unhideWhenUsed/>
@@ -34758,11 +34782,11 @@
       <w:color w:val="2F5496" w:themeColor="accent1" w:themeShade="BF"/>
     </w:rPr>
   </w:style>
-  <w:style w:type="paragraph" w:styleId="Heading6">
+  <w:style w:type="paragraph" w:styleId="u6">
     <w:name w:val="heading 6"/>
-    <w:basedOn w:val="Normal"/>
-    <w:next w:val="Normal"/>
-    <w:link w:val="Heading6Char"/>
+    <w:basedOn w:val="Binhthng"/>
+    <w:next w:val="Binhthng"/>
+    <w:link w:val="u6Char"/>
     <w:uiPriority w:val="9"/>
     <w:semiHidden/>
     <w:unhideWhenUsed/>
@@ -34781,11 +34805,11 @@
       <w:color w:val="595959" w:themeColor="text1" w:themeTint="A6"/>
     </w:rPr>
   </w:style>
-  <w:style w:type="paragraph" w:styleId="Heading7">
+  <w:style w:type="paragraph" w:styleId="u7">
     <w:name w:val="heading 7"/>
-    <w:basedOn w:val="Normal"/>
-    <w:next w:val="Normal"/>
-    <w:link w:val="Heading7Char"/>
+    <w:basedOn w:val="Binhthng"/>
+    <w:next w:val="Binhthng"/>
+    <w:link w:val="u7Char"/>
     <w:uiPriority w:val="9"/>
     <w:semiHidden/>
     <w:unhideWhenUsed/>
@@ -34802,11 +34826,11 @@
       <w:color w:val="595959" w:themeColor="text1" w:themeTint="A6"/>
     </w:rPr>
   </w:style>
-  <w:style w:type="paragraph" w:styleId="Heading8">
+  <w:style w:type="paragraph" w:styleId="u8">
     <w:name w:val="heading 8"/>
-    <w:basedOn w:val="Normal"/>
-    <w:next w:val="Normal"/>
-    <w:link w:val="Heading8Char"/>
+    <w:basedOn w:val="Binhthng"/>
+    <w:next w:val="Binhthng"/>
+    <w:link w:val="u8Char"/>
     <w:uiPriority w:val="9"/>
     <w:semiHidden/>
     <w:unhideWhenUsed/>
@@ -34825,11 +34849,11 @@
       <w:color w:val="272727" w:themeColor="text1" w:themeTint="D8"/>
     </w:rPr>
   </w:style>
-  <w:style w:type="paragraph" w:styleId="Heading9">
+  <w:style w:type="paragraph" w:styleId="u9">
     <w:name w:val="heading 9"/>
-    <w:basedOn w:val="Normal"/>
-    <w:next w:val="Normal"/>
-    <w:link w:val="Heading9Char"/>
+    <w:basedOn w:val="Binhthng"/>
+    <w:next w:val="Binhthng"/>
+    <w:link w:val="u9Char"/>
     <w:uiPriority w:val="9"/>
     <w:semiHidden/>
     <w:unhideWhenUsed/>
@@ -34846,12 +34870,13 @@
       <w:color w:val="272727" w:themeColor="text1" w:themeTint="D8"/>
     </w:rPr>
   </w:style>
-  <w:style w:type="character" w:default="1" w:styleId="DefaultParagraphFont">
+  <w:style w:type="character" w:default="1" w:styleId="Phngmcinhcuaoanvn">
     <w:name w:val="Default Paragraph Font"/>
     <w:uiPriority w:val="1"/>
+    <w:semiHidden/>
     <w:unhideWhenUsed/>
   </w:style>
-  <w:style w:type="table" w:default="1" w:styleId="TableNormal">
+  <w:style w:type="table" w:default="1" w:styleId="BangThngthng">
     <w:name w:val="Normal Table"/>
     <w:uiPriority w:val="99"/>
     <w:semiHidden/>
@@ -34866,16 +34891,16 @@
       </w:tblCellMar>
     </w:tblPr>
   </w:style>
-  <w:style w:type="numbering" w:default="1" w:styleId="NoList">
+  <w:style w:type="numbering" w:default="1" w:styleId="Khngco">
     <w:name w:val="No List"/>
     <w:uiPriority w:val="99"/>
     <w:semiHidden/>
     <w:unhideWhenUsed/>
   </w:style>
-  <w:style w:type="character" w:customStyle="1" w:styleId="Heading1Char">
-    <w:name w:val="Heading 1 Char"/>
-    <w:basedOn w:val="DefaultParagraphFont"/>
-    <w:link w:val="Heading1"/>
+  <w:style w:type="character" w:customStyle="1" w:styleId="u1Char">
+    <w:name w:val="Đầu đề 1 Char"/>
+    <w:basedOn w:val="Phngmcinhcuaoanvn"/>
+    <w:link w:val="u1"/>
     <w:uiPriority w:val="9"/>
     <w:rsid w:val="00C35CE0"/>
     <w:rPr>
@@ -34885,10 +34910,10 @@
       <w:szCs w:val="40"/>
     </w:rPr>
   </w:style>
-  <w:style w:type="character" w:customStyle="1" w:styleId="Heading2Char">
-    <w:name w:val="Heading 2 Char"/>
-    <w:basedOn w:val="DefaultParagraphFont"/>
-    <w:link w:val="Heading2"/>
+  <w:style w:type="character" w:customStyle="1" w:styleId="u2Char">
+    <w:name w:val="Đầu đề 2 Char"/>
+    <w:basedOn w:val="Phngmcinhcuaoanvn"/>
+    <w:link w:val="u2"/>
     <w:uiPriority w:val="9"/>
     <w:rsid w:val="00C35CE0"/>
     <w:rPr>
@@ -34898,10 +34923,10 @@
       <w:szCs w:val="32"/>
     </w:rPr>
   </w:style>
-  <w:style w:type="character" w:customStyle="1" w:styleId="Heading3Char">
-    <w:name w:val="Heading 3 Char"/>
-    <w:basedOn w:val="DefaultParagraphFont"/>
-    <w:link w:val="Heading3"/>
+  <w:style w:type="character" w:customStyle="1" w:styleId="u3Char">
+    <w:name w:val="Đầu đề 3 Char"/>
+    <w:basedOn w:val="Phngmcinhcuaoanvn"/>
+    <w:link w:val="u3"/>
     <w:uiPriority w:val="9"/>
     <w:semiHidden/>
     <w:rsid w:val="00C35CE0"/>
@@ -34912,10 +34937,10 @@
       <w:szCs w:val="28"/>
     </w:rPr>
   </w:style>
-  <w:style w:type="character" w:customStyle="1" w:styleId="Heading4Char">
-    <w:name w:val="Heading 4 Char"/>
-    <w:basedOn w:val="DefaultParagraphFont"/>
-    <w:link w:val="Heading4"/>
+  <w:style w:type="character" w:customStyle="1" w:styleId="u4Char">
+    <w:name w:val="Đầu đề 4 Char"/>
+    <w:basedOn w:val="Phngmcinhcuaoanvn"/>
+    <w:link w:val="u4"/>
     <w:uiPriority w:val="9"/>
     <w:semiHidden/>
     <w:rsid w:val="00C35CE0"/>
@@ -34926,10 +34951,10 @@
       <w:color w:val="2F5496" w:themeColor="accent1" w:themeShade="BF"/>
     </w:rPr>
   </w:style>
-  <w:style w:type="character" w:customStyle="1" w:styleId="Heading5Char">
-    <w:name w:val="Heading 5 Char"/>
-    <w:basedOn w:val="DefaultParagraphFont"/>
-    <w:link w:val="Heading5"/>
+  <w:style w:type="character" w:customStyle="1" w:styleId="u5Char">
+    <w:name w:val="Đầu đề 5 Char"/>
+    <w:basedOn w:val="Phngmcinhcuaoanvn"/>
+    <w:link w:val="u5"/>
     <w:uiPriority w:val="9"/>
     <w:semiHidden/>
     <w:rsid w:val="00C35CE0"/>
@@ -34938,10 +34963,10 @@
       <w:color w:val="2F5496" w:themeColor="accent1" w:themeShade="BF"/>
     </w:rPr>
   </w:style>
-  <w:style w:type="character" w:customStyle="1" w:styleId="Heading6Char">
-    <w:name w:val="Heading 6 Char"/>
-    <w:basedOn w:val="DefaultParagraphFont"/>
-    <w:link w:val="Heading6"/>
+  <w:style w:type="character" w:customStyle="1" w:styleId="u6Char">
+    <w:name w:val="Đầu đề 6 Char"/>
+    <w:basedOn w:val="Phngmcinhcuaoanvn"/>
+    <w:link w:val="u6"/>
     <w:uiPriority w:val="9"/>
     <w:semiHidden/>
     <w:rsid w:val="00C35CE0"/>
@@ -34952,10 +34977,10 @@
       <w:color w:val="595959" w:themeColor="text1" w:themeTint="A6"/>
     </w:rPr>
   </w:style>
-  <w:style w:type="character" w:customStyle="1" w:styleId="Heading7Char">
-    <w:name w:val="Heading 7 Char"/>
-    <w:basedOn w:val="DefaultParagraphFont"/>
-    <w:link w:val="Heading7"/>
+  <w:style w:type="character" w:customStyle="1" w:styleId="u7Char">
+    <w:name w:val="Đầu đề 7 Char"/>
+    <w:basedOn w:val="Phngmcinhcuaoanvn"/>
+    <w:link w:val="u7"/>
     <w:uiPriority w:val="9"/>
     <w:semiHidden/>
     <w:rsid w:val="00C35CE0"/>
@@ -34964,10 +34989,10 @@
       <w:color w:val="595959" w:themeColor="text1" w:themeTint="A6"/>
     </w:rPr>
   </w:style>
-  <w:style w:type="character" w:customStyle="1" w:styleId="Heading8Char">
-    <w:name w:val="Heading 8 Char"/>
-    <w:basedOn w:val="DefaultParagraphFont"/>
-    <w:link w:val="Heading8"/>
+  <w:style w:type="character" w:customStyle="1" w:styleId="u8Char">
+    <w:name w:val="Đầu đề 8 Char"/>
+    <w:basedOn w:val="Phngmcinhcuaoanvn"/>
+    <w:link w:val="u8"/>
     <w:uiPriority w:val="9"/>
     <w:semiHidden/>
     <w:rsid w:val="00C35CE0"/>
@@ -34978,10 +35003,10 @@
       <w:color w:val="272727" w:themeColor="text1" w:themeTint="D8"/>
     </w:rPr>
   </w:style>
-  <w:style w:type="character" w:customStyle="1" w:styleId="Heading9Char">
-    <w:name w:val="Heading 9 Char"/>
-    <w:basedOn w:val="DefaultParagraphFont"/>
-    <w:link w:val="Heading9"/>
+  <w:style w:type="character" w:customStyle="1" w:styleId="u9Char">
+    <w:name w:val="Đầu đề 9 Char"/>
+    <w:basedOn w:val="Phngmcinhcuaoanvn"/>
+    <w:link w:val="u9"/>
     <w:uiPriority w:val="9"/>
     <w:semiHidden/>
     <w:rsid w:val="00C35CE0"/>
@@ -34990,11 +35015,11 @@
       <w:color w:val="272727" w:themeColor="text1" w:themeTint="D8"/>
     </w:rPr>
   </w:style>
-  <w:style w:type="paragraph" w:styleId="Title">
+  <w:style w:type="paragraph" w:styleId="Tiu">
     <w:name w:val="Title"/>
-    <w:basedOn w:val="Normal"/>
-    <w:next w:val="Normal"/>
-    <w:link w:val="TitleChar"/>
+    <w:basedOn w:val="Binhthng"/>
+    <w:next w:val="Binhthng"/>
+    <w:link w:val="TiuChar"/>
     <w:uiPriority w:val="10"/>
     <w:qFormat/>
     <w:rsid w:val="00C35CE0"/>
@@ -35010,10 +35035,10 @@
       <w:szCs w:val="56"/>
     </w:rPr>
   </w:style>
-  <w:style w:type="character" w:customStyle="1" w:styleId="TitleChar">
-    <w:name w:val="Title Char"/>
-    <w:basedOn w:val="DefaultParagraphFont"/>
-    <w:link w:val="Title"/>
+  <w:style w:type="character" w:customStyle="1" w:styleId="TiuChar">
+    <w:name w:val="Tiêu đề Char"/>
+    <w:basedOn w:val="Phngmcinhcuaoanvn"/>
+    <w:link w:val="Tiu"/>
     <w:uiPriority w:val="10"/>
     <w:rsid w:val="00C35CE0"/>
     <w:rPr>
@@ -35024,11 +35049,11 @@
       <w:szCs w:val="56"/>
     </w:rPr>
   </w:style>
-  <w:style w:type="paragraph" w:styleId="Subtitle">
+  <w:style w:type="paragraph" w:styleId="Tiuphu">
     <w:name w:val="Subtitle"/>
-    <w:basedOn w:val="Normal"/>
-    <w:next w:val="Normal"/>
-    <w:link w:val="SubtitleChar"/>
+    <w:basedOn w:val="Binhthng"/>
+    <w:next w:val="Binhthng"/>
+    <w:link w:val="TiuphuChar"/>
     <w:uiPriority w:val="11"/>
     <w:qFormat/>
     <w:rsid w:val="00C35CE0"/>
@@ -35045,10 +35070,10 @@
       <w:szCs w:val="28"/>
     </w:rPr>
   </w:style>
-  <w:style w:type="character" w:customStyle="1" w:styleId="SubtitleChar">
-    <w:name w:val="Subtitle Char"/>
-    <w:basedOn w:val="DefaultParagraphFont"/>
-    <w:link w:val="Subtitle"/>
+  <w:style w:type="character" w:customStyle="1" w:styleId="TiuphuChar">
+    <w:name w:val="Tiêu đề phụ Char"/>
+    <w:basedOn w:val="Phngmcinhcuaoanvn"/>
+    <w:link w:val="Tiuphu"/>
     <w:uiPriority w:val="11"/>
     <w:rsid w:val="00C35CE0"/>
     <w:rPr>
@@ -35059,11 +35084,11 @@
       <w:szCs w:val="28"/>
     </w:rPr>
   </w:style>
-  <w:style w:type="paragraph" w:styleId="Quote">
+  <w:style w:type="paragraph" w:styleId="Litrichdn">
     <w:name w:val="Quote"/>
-    <w:basedOn w:val="Normal"/>
-    <w:next w:val="Normal"/>
-    <w:link w:val="QuoteChar"/>
+    <w:basedOn w:val="Binhthng"/>
+    <w:next w:val="Binhthng"/>
+    <w:link w:val="LitrichdnChar"/>
     <w:uiPriority w:val="29"/>
     <w:qFormat/>
     <w:rsid w:val="00C35CE0"/>
@@ -35077,10 +35102,10 @@
       <w:color w:val="404040" w:themeColor="text1" w:themeTint="BF"/>
     </w:rPr>
   </w:style>
-  <w:style w:type="character" w:customStyle="1" w:styleId="QuoteChar">
-    <w:name w:val="Quote Char"/>
-    <w:basedOn w:val="DefaultParagraphFont"/>
-    <w:link w:val="Quote"/>
+  <w:style w:type="character" w:customStyle="1" w:styleId="LitrichdnChar">
+    <w:name w:val="Lời trích dẫn Char"/>
+    <w:basedOn w:val="Phngmcinhcuaoanvn"/>
+    <w:link w:val="Litrichdn"/>
     <w:uiPriority w:val="29"/>
     <w:rsid w:val="00C35CE0"/>
     <w:rPr>
@@ -35089,9 +35114,9 @@
       <w:color w:val="404040" w:themeColor="text1" w:themeTint="BF"/>
     </w:rPr>
   </w:style>
-  <w:style w:type="paragraph" w:styleId="ListParagraph">
+  <w:style w:type="paragraph" w:styleId="oancuaDanhsach">
     <w:name w:val="List Paragraph"/>
-    <w:basedOn w:val="Normal"/>
+    <w:basedOn w:val="Binhthng"/>
     <w:uiPriority w:val="34"/>
     <w:qFormat/>
     <w:rsid w:val="00C35CE0"/>
@@ -35100,9 +35125,9 @@
       <w:contextualSpacing/>
     </w:pPr>
   </w:style>
-  <w:style w:type="character" w:styleId="IntenseEmphasis">
+  <w:style w:type="character" w:styleId="NhnmnhThm">
     <w:name w:val="Intense Emphasis"/>
-    <w:basedOn w:val="DefaultParagraphFont"/>
+    <w:basedOn w:val="Phngmcinhcuaoanvn"/>
     <w:uiPriority w:val="21"/>
     <w:qFormat/>
     <w:rsid w:val="00C35CE0"/>
@@ -35112,11 +35137,11 @@
       <w:color w:val="2F5496" w:themeColor="accent1" w:themeShade="BF"/>
     </w:rPr>
   </w:style>
-  <w:style w:type="paragraph" w:styleId="IntenseQuote">
+  <w:style w:type="paragraph" w:styleId="Nhaykepm">
     <w:name w:val="Intense Quote"/>
-    <w:basedOn w:val="Normal"/>
-    <w:next w:val="Normal"/>
-    <w:link w:val="IntenseQuoteChar"/>
+    <w:basedOn w:val="Binhthng"/>
+    <w:next w:val="Binhthng"/>
+    <w:link w:val="NhaykepmChar"/>
     <w:uiPriority w:val="30"/>
     <w:qFormat/>
     <w:rsid w:val="00C35CE0"/>
@@ -35135,10 +35160,10 @@
       <w:color w:val="2F5496" w:themeColor="accent1" w:themeShade="BF"/>
     </w:rPr>
   </w:style>
-  <w:style w:type="character" w:customStyle="1" w:styleId="IntenseQuoteChar">
-    <w:name w:val="Intense Quote Char"/>
-    <w:basedOn w:val="DefaultParagraphFont"/>
-    <w:link w:val="IntenseQuote"/>
+  <w:style w:type="character" w:customStyle="1" w:styleId="NhaykepmChar">
+    <w:name w:val="Nháy kép Đậm Char"/>
+    <w:basedOn w:val="Phngmcinhcuaoanvn"/>
+    <w:link w:val="Nhaykepm"/>
     <w:uiPriority w:val="30"/>
     <w:rsid w:val="00C35CE0"/>
     <w:rPr>
@@ -35147,9 +35172,9 @@
       <w:color w:val="2F5496" w:themeColor="accent1" w:themeShade="BF"/>
     </w:rPr>
   </w:style>
-  <w:style w:type="character" w:styleId="IntenseReference">
+  <w:style w:type="character" w:styleId="ThamchiuNhnmnh">
     <w:name w:val="Intense Reference"/>
-    <w:basedOn w:val="DefaultParagraphFont"/>
+    <w:basedOn w:val="Phngmcinhcuaoanvn"/>
     <w:uiPriority w:val="32"/>
     <w:qFormat/>
     <w:rsid w:val="00C35CE0"/>
@@ -35163,7 +35188,7 @@
   </w:style>
   <w:style w:type="paragraph" w:customStyle="1" w:styleId="msonormal0">
     <w:name w:val="msonormal"/>
-    <w:basedOn w:val="Normal"/>
+    <w:basedOn w:val="Binhthng"/>
     <w:rsid w:val="00C35CE0"/>
     <w:pPr>
       <w:spacing w:before="100" w:beforeAutospacing="1" w:after="100" w:afterAutospacing="1" w:line="240" w:lineRule="auto"/>
@@ -35174,9 +35199,9 @@
       <w14:ligatures w14:val="none"/>
     </w:rPr>
   </w:style>
-  <w:style w:type="paragraph" w:styleId="NormalWeb">
+  <w:style w:type="paragraph" w:styleId="ThngthngWeb">
     <w:name w:val="Normal (Web)"/>
-    <w:basedOn w:val="Normal"/>
+    <w:basedOn w:val="Binhthng"/>
     <w:uiPriority w:val="99"/>
     <w:semiHidden/>
     <w:unhideWhenUsed/>
@@ -35190,10 +35215,10 @@
       <w14:ligatures w14:val="none"/>
     </w:rPr>
   </w:style>
-  <w:style w:type="paragraph" w:styleId="TOCHeading">
+  <w:style w:type="paragraph" w:styleId="uMucluc">
     <w:name w:val="TOC Heading"/>
-    <w:basedOn w:val="Heading1"/>
-    <w:next w:val="Normal"/>
+    <w:basedOn w:val="u1"/>
+    <w:next w:val="Binhthng"/>
     <w:uiPriority w:val="39"/>
     <w:unhideWhenUsed/>
     <w:qFormat/>
@@ -35209,10 +35234,10 @@
       <w14:ligatures w14:val="none"/>
     </w:rPr>
   </w:style>
-  <w:style w:type="paragraph" w:styleId="TOC1">
+  <w:style w:type="paragraph" w:styleId="Mucluc1">
     <w:name w:val="toc 1"/>
-    <w:basedOn w:val="Normal"/>
-    <w:next w:val="Normal"/>
+    <w:basedOn w:val="Binhthng"/>
+    <w:next w:val="Binhthng"/>
     <w:autoRedefine/>
     <w:uiPriority w:val="39"/>
     <w:unhideWhenUsed/>
@@ -35221,9 +35246,9 @@
       <w:spacing w:after="100"/>
     </w:pPr>
   </w:style>
-  <w:style w:type="character" w:styleId="Hyperlink">
+  <w:style w:type="character" w:styleId="Siuktni">
     <w:name w:val="Hyperlink"/>
-    <w:basedOn w:val="DefaultParagraphFont"/>
+    <w:basedOn w:val="Phngmcinhcuaoanvn"/>
     <w:uiPriority w:val="99"/>
     <w:unhideWhenUsed/>
     <w:rsid w:val="00C20BFC"/>
@@ -35232,10 +35257,10 @@
       <w:u w:val="single"/>
     </w:rPr>
   </w:style>
-  <w:style w:type="paragraph" w:styleId="Header">
+  <w:style w:type="paragraph" w:styleId="utrang">
     <w:name w:val="header"/>
-    <w:basedOn w:val="Normal"/>
-    <w:link w:val="HeaderChar"/>
+    <w:basedOn w:val="Binhthng"/>
+    <w:link w:val="utrangChar"/>
     <w:uiPriority w:val="99"/>
     <w:unhideWhenUsed/>
     <w:rsid w:val="00C20BFC"/>
@@ -35247,17 +35272,17 @@
       <w:spacing w:after="0" w:line="240" w:lineRule="auto"/>
     </w:pPr>
   </w:style>
-  <w:style w:type="character" w:customStyle="1" w:styleId="HeaderChar">
-    <w:name w:val="Header Char"/>
-    <w:basedOn w:val="DefaultParagraphFont"/>
-    <w:link w:val="Header"/>
+  <w:style w:type="character" w:customStyle="1" w:styleId="utrangChar">
+    <w:name w:val="Đầu trang Char"/>
+    <w:basedOn w:val="Phngmcinhcuaoanvn"/>
+    <w:link w:val="utrang"/>
     <w:uiPriority w:val="99"/>
     <w:rsid w:val="00C20BFC"/>
   </w:style>
-  <w:style w:type="paragraph" w:styleId="Footer">
+  <w:style w:type="paragraph" w:styleId="Chntrang">
     <w:name w:val="footer"/>
-    <w:basedOn w:val="Normal"/>
-    <w:link w:val="FooterChar"/>
+    <w:basedOn w:val="Binhthng"/>
+    <w:link w:val="ChntrangChar"/>
     <w:uiPriority w:val="99"/>
     <w:unhideWhenUsed/>
     <w:rsid w:val="00C20BFC"/>
@@ -35269,10 +35294,10 @@
       <w:spacing w:after="0" w:line="240" w:lineRule="auto"/>
     </w:pPr>
   </w:style>
-  <w:style w:type="character" w:customStyle="1" w:styleId="FooterChar">
-    <w:name w:val="Footer Char"/>
-    <w:basedOn w:val="DefaultParagraphFont"/>
-    <w:link w:val="Footer"/>
+  <w:style w:type="character" w:customStyle="1" w:styleId="ChntrangChar">
+    <w:name w:val="Chân trang Char"/>
+    <w:basedOn w:val="Phngmcinhcuaoanvn"/>
+    <w:link w:val="Chntrang"/>
     <w:uiPriority w:val="99"/>
     <w:rsid w:val="00C20BFC"/>
   </w:style>

</xml_diff>